<commit_message>
feat(v1.2.0): Invoice Data management hub, 30-day Recycle Bin recovery vault, searchable customer combobox, universal white mode high-contrast typography, and enhanced PDF export
</commit_message>
<xml_diff>
--- a/documentation/KwikStore_Pro_Customer_SOP_Manual.docx
+++ b/documentation/KwikStore_Pro_Customer_SOP_Manual.docx
@@ -104,7 +104,7 @@
                 <w:sz w:val="22"/>
                 <w:szCs w:val="22"/>
               </w:rPr>
-              <w:t xml:space="preserve">Thank you for purchasing KwikStore Pro! For 24/7 priority support, setup assistance, license key renewals, or barcode scanner configuration, reach us via WhatsApp &amp; Call at +91 8338833377 or visit https://fleetbillpro.com.</w:t>
+              <w:t xml:space="preserve">Thank you for choosing KwikStore Pro! For 24/7 priority support, setup assistance, license renewals, or hardware setup (printers, barcode scanners, multi-counter LAN), reach our support team via WhatsApp &amp; Call at +91 8338833377 or visit https://fleetbillpro.in.</w:t>
             </w:r>
           </w:p>
         </w:tc>
@@ -318,7 +318,7 @@
                 <w:sz w:val="20"/>
                 <w:szCs w:val="20"/>
               </w:rPr>
-              <w:t xml:space="preserve">Version 1.0.0 (Windows &amp; macOS Native)</w:t>
+              <w:t xml:space="preserve">Version 1.1.0 (Windows .exe &amp; macOS .dmg Native)</w:t>
             </w:r>
           </w:p>
         </w:tc>
@@ -380,7 +380,7 @@
                 <w:sz w:val="20"/>
                 <w:szCs w:val="20"/>
               </w:rPr>
-              <w:t xml:space="preserve">Garments, Pharmacy, Hardware, Supermarket, General Retail</w:t>
+              <w:t xml:space="preserve">Retail, Wholesale Distributor, Pharmacy, Garments, Hardware, Supermarket</w:t>
             </w:r>
           </w:p>
         </w:tc>
@@ -442,7 +442,7 @@
                 <w:sz w:val="20"/>
                 <w:szCs w:val="20"/>
               </w:rPr>
-              <w:t xml:space="preserve">Machine-Locked Cryptographic Key (Offline &amp; Secure)</w:t>
+              <w:t xml:space="preserve">Machine-Locked Cryptographic Key (100% Offline &amp; Secure)</w:t>
             </w:r>
           </w:p>
         </w:tc>
@@ -504,7 +504,7 @@
                 <w:sz w:val="20"/>
                 <w:szCs w:val="20"/>
               </w:rPr>
-              <w:t xml:space="preserve">Offline-First SQLite Database with Multi-Counter LAN Sync</w:t>
+              <w:t xml:space="preserve">Offline-First SQLite Engine with Multi-Counter LAN Sync</w:t>
             </w:r>
           </w:p>
         </w:tc>
@@ -536,7 +536,7 @@
                 <w:sz w:val="20"/>
                 <w:szCs w:val="20"/>
               </w:rPr>
-              <w:t xml:space="preserve">Helpline &amp; WhatsApp</w:t>
+              <w:t xml:space="preserve">Hardware Integration</w:t>
             </w:r>
           </w:p>
         </w:tc>
@@ -566,7 +566,7 @@
                 <w:sz w:val="20"/>
                 <w:szCs w:val="20"/>
               </w:rPr>
-              <w:t xml:space="preserve">+91 8338833377</w:t>
+              <w:t xml:space="preserve">Thermal POS Printers (80mm/58mm), Laser A4, USB HID Barcode Scanners, Cash Drawers</w:t>
             </w:r>
           </w:p>
         </w:tc>
@@ -598,7 +598,7 @@
                 <w:sz w:val="20"/>
                 <w:szCs w:val="20"/>
               </w:rPr>
-              <w:t xml:space="preserve">Website &amp; Updates</w:t>
+              <w:t xml:space="preserve">Helpline &amp; WhatsApp</w:t>
             </w:r>
           </w:p>
         </w:tc>
@@ -628,7 +628,69 @@
                 <w:sz w:val="20"/>
                 <w:szCs w:val="20"/>
               </w:rPr>
-              <w:t xml:space="preserve">https://fleetbillpro.com | https://github.com/RJRAJESH14/KwikStore</w:t>
+              <w:t xml:space="preserve">+91 8338833377</w:t>
+            </w:r>
+          </w:p>
+        </w:tc>
+      </w:tr>
+      <w:tr>
+        <w:tc>
+          <w:tcPr>
+            <w:tcBorders>
+              <w:top w:val="single" w:color="CBD5E1" w:sz="2"/>
+              <w:left w:val="single" w:color="CBD5E1" w:sz="2"/>
+              <w:bottom w:val="single" w:color="CBD5E1" w:sz="2"/>
+              <w:right w:val="single" w:color="CBD5E1" w:sz="2"/>
+            </w:tcBorders>
+            <w:shd w:fill="F8FAFC" w:val="clear"/>
+            <w:tcMar>
+              <w:top w:type="dxa" w:w="100"/>
+              <w:left w:type="dxa" w:w="140"/>
+              <w:bottom w:type="dxa" w:w="100"/>
+              <w:right w:type="dxa" w:w="140"/>
+            </w:tcMar>
+          </w:tcPr>
+          <w:p>
+            <w:r>
+              <w:rPr>
+                <w:rFonts w:ascii="Calibri" w:cs="Calibri" w:eastAsia="Calibri" w:hAnsi="Calibri"/>
+                <w:b/>
+                <w:bCs/>
+                <w:color w:val="1E293B"/>
+                <w:sz w:val="20"/>
+                <w:szCs w:val="20"/>
+              </w:rPr>
+              <w:t xml:space="preserve">Official Portal</w:t>
+            </w:r>
+          </w:p>
+        </w:tc>
+        <w:tc>
+          <w:tcPr>
+            <w:tcBorders>
+              <w:top w:val="single" w:color="CBD5E1" w:sz="2"/>
+              <w:left w:val="single" w:color="CBD5E1" w:sz="2"/>
+              <w:bottom w:val="single" w:color="CBD5E1" w:sz="2"/>
+              <w:right w:val="single" w:color="CBD5E1" w:sz="2"/>
+            </w:tcBorders>
+            <w:shd w:fill="F8FAFC" w:val="clear"/>
+            <w:tcMar>
+              <w:top w:type="dxa" w:w="100"/>
+              <w:left w:type="dxa" w:w="140"/>
+              <w:bottom w:type="dxa" w:w="100"/>
+              <w:right w:type="dxa" w:w="140"/>
+            </w:tcMar>
+          </w:tcPr>
+          <w:p>
+            <w:r>
+              <w:rPr>
+                <w:rFonts w:ascii="Calibri" w:cs="Calibri" w:eastAsia="Calibri" w:hAnsi="Calibri"/>
+                <w:b w:val="false"/>
+                <w:bCs w:val="false"/>
+                <w:color w:val="1E293B"/>
+                <w:sz w:val="20"/>
+                <w:szCs w:val="20"/>
+              </w:rPr>
+              <w:t xml:space="preserve">https://fleetbillpro.in</w:t>
             </w:r>
           </w:p>
         </w:tc>
@@ -696,7 +758,7 @@
           <w:sz w:val="22"/>
           <w:szCs w:val="22"/>
         </w:rPr>
-        <w:t xml:space="preserve">Installation, Software Activation &amp; Hardware Machine ID</w:t>
+        <w:t xml:space="preserve">Installation, Software Activation &amp; Machine ID Fingerprint</w:t>
       </w:r>
     </w:p>
     <w:p>
@@ -746,7 +808,7 @@
           <w:sz w:val="22"/>
           <w:szCs w:val="22"/>
         </w:rPr>
-        <w:t xml:space="preserve">First-Time Shop Profile &amp; GST Configuration</w:t>
+        <w:t xml:space="preserve">First-Time Shop Profile, GST &amp; Rate Tier Configuration</w:t>
       </w:r>
     </w:p>
     <w:p>
@@ -771,7 +833,7 @@
           <w:sz w:val="22"/>
           <w:szCs w:val="22"/>
         </w:rPr>
-        <w:t xml:space="preserve">Staff Management &amp; Role-Based Access (Owner vs Cashier)</w:t>
+        <w:t xml:space="preserve">Hardware &amp; LAN Multi-Counter System (Printers, Barcode Scanners &amp; Network Hub)</w:t>
       </w:r>
     </w:p>
     <w:p>
@@ -796,7 +858,7 @@
           <w:sz w:val="22"/>
           <w:szCs w:val="22"/>
         </w:rPr>
-        <w:t xml:space="preserve">Master Inventory &amp; Product Catalog Setup</w:t>
+        <w:t xml:space="preserve">Staff Management &amp; Role-Based Access Control (RBAC)</w:t>
       </w:r>
     </w:p>
     <w:p>
@@ -821,7 +883,7 @@
           <w:sz w:val="22"/>
           <w:szCs w:val="22"/>
         </w:rPr>
-        <w:t xml:space="preserve">POS Fast Billing Counter &amp; Day-to-Day Sales Operations</w:t>
+        <w:t xml:space="preserve">Master Inventory, Dual-Units, Garment Sizes &amp; Pharmacy Batches</w:t>
       </w:r>
     </w:p>
     <w:p>
@@ -846,7 +908,7 @@
           <w:sz w:val="22"/>
           <w:szCs w:val="22"/>
         </w:rPr>
-        <w:t xml:space="preserve">Customer Khata &amp; Udhar (Credit) Management</w:t>
+        <w:t xml:space="preserve">POS Fast Billing Counter, Distributor Tiers &amp; Day-to-Day Sales</w:t>
       </w:r>
     </w:p>
     <w:p>
@@ -871,6 +933,31 @@
           <w:sz w:val="22"/>
           <w:szCs w:val="22"/>
         </w:rPr>
+        <w:t xml:space="preserve">Customer Khata &amp; Udhar (Credit) Ledger Management</w:t>
+      </w:r>
+    </w:p>
+    <w:p>
+      <w:pPr>
+        <w:spacing w:after="60" w:before="60"/>
+      </w:pPr>
+      <w:r>
+        <w:rPr>
+          <w:rFonts w:ascii="Calibri" w:cs="Calibri" w:eastAsia="Calibri" w:hAnsi="Calibri"/>
+          <w:b/>
+          <w:bCs/>
+          <w:color w:val="005A9C"/>
+          <w:sz w:val="22"/>
+          <w:szCs w:val="22"/>
+        </w:rPr>
+        <w:t xml:space="preserve">• Chapter 9: </w:t>
+      </w:r>
+      <w:r>
+        <w:rPr>
+          <w:rFonts w:ascii="Calibri" w:cs="Calibri" w:eastAsia="Calibri" w:hAnsi="Calibri"/>
+          <w:color w:val="1E293B"/>
+          <w:sz w:val="22"/>
+          <w:szCs w:val="22"/>
+        </w:rPr>
         <w:t xml:space="preserve">Sales Analytics, Profit &amp; Loss &amp; GSTR-1 Tax Filing Reports</w:t>
       </w:r>
     </w:p>
@@ -887,16 +974,16 @@
           <w:sz w:val="22"/>
           <w:szCs w:val="22"/>
         </w:rPr>
-        <w:t xml:space="preserve">• Chapter 9: </w:t>
-      </w:r>
-      <w:r>
-        <w:rPr>
-          <w:rFonts w:ascii="Calibri" w:cs="Calibri" w:eastAsia="Calibri" w:hAnsi="Calibri"/>
-          <w:color w:val="1E293B"/>
-          <w:sz w:val="22"/>
-          <w:szCs w:val="22"/>
-        </w:rPr>
-        <w:t xml:space="preserve">Data Backup, Disaster Recovery &amp; Reinstalling Old Data</w:t>
+        <w:t xml:space="preserve">• Chapter 10: </w:t>
+      </w:r>
+      <w:r>
+        <w:rPr>
+          <w:rFonts w:ascii="Calibri" w:cs="Calibri" w:eastAsia="Calibri" w:hAnsi="Calibri"/>
+          <w:color w:val="1E293B"/>
+          <w:sz w:val="22"/>
+          <w:szCs w:val="22"/>
+        </w:rPr>
+        <w:t xml:space="preserve">Data Backup, Disaster Recovery &amp; PC Migration</w:t>
       </w:r>
     </w:p>
     <w:p>
@@ -912,7 +999,7 @@
           <w:sz w:val="22"/>
           <w:szCs w:val="22"/>
         </w:rPr>
-        <w:t xml:space="preserve">• Chapter 10: </w:t>
+        <w:t xml:space="preserve">• Chapter 11: </w:t>
       </w:r>
       <w:r>
         <w:rPr>
@@ -978,25 +1065,25 @@
         </w:rPr>
       </w:pPr>
       <w:r>
-        <w:t xml:space="preserve">1.1 Windows Installation</w:t>
-      </w:r>
-    </w:p>
-    <w:p>
-      <w:pPr>
-        <w:spacing w:after="80" w:before="80"/>
-      </w:pPr>
-      <w:r>
-        <w:rPr>
-          <w:rFonts w:ascii="Calibri" w:cs="Calibri" w:eastAsia="Calibri" w:hAnsi="Calibri"/>
-          <w:b w:val="false"/>
-          <w:bCs w:val="false"/>
-          <w:i w:val="false"/>
-          <w:iCs w:val="false"/>
-          <w:color w:val="1E293B"/>
-          <w:sz w:val="22"/>
-          <w:szCs w:val="22"/>
-        </w:rPr>
-        <w:t xml:space="preserve">1. Locate the file named "KwikStore Pro Setup 1.0.0.exe" from your setup package or USB drive.</w:t>
+        <w:t xml:space="preserve">1.1 Windows Installation (.exe)</w:t>
+      </w:r>
+    </w:p>
+    <w:p>
+      <w:pPr>
+        <w:spacing w:after="80" w:before="80"/>
+      </w:pPr>
+      <w:r>
+        <w:rPr>
+          <w:rFonts w:ascii="Calibri" w:cs="Calibri" w:eastAsia="Calibri" w:hAnsi="Calibri"/>
+          <w:b w:val="false"/>
+          <w:bCs w:val="false"/>
+          <w:i w:val="false"/>
+          <w:iCs w:val="false"/>
+          <w:color w:val="1E293B"/>
+          <w:sz w:val="22"/>
+          <w:szCs w:val="22"/>
+        </w:rPr>
+        <w:t xml:space="preserve">1. Locate the file named "KwikStore Pro Setup 1.1.0.exe" from your setup package or USB drive.</w:t>
       </w:r>
     </w:p>
     <w:p>
@@ -1085,25 +1172,25 @@
         </w:rPr>
       </w:pPr>
       <w:r>
-        <w:t xml:space="preserve">1.2 macOS Installation (Intel &amp; Apple Silicon M1/M2/M3/M4)</w:t>
-      </w:r>
-    </w:p>
-    <w:p>
-      <w:pPr>
-        <w:spacing w:after="80" w:before="80"/>
-      </w:pPr>
-      <w:r>
-        <w:rPr>
-          <w:rFonts w:ascii="Calibri" w:cs="Calibri" w:eastAsia="Calibri" w:hAnsi="Calibri"/>
-          <w:b w:val="false"/>
-          <w:bCs w:val="false"/>
-          <w:i w:val="false"/>
-          <w:iCs w:val="false"/>
-          <w:color w:val="1E293B"/>
-          <w:sz w:val="22"/>
-          <w:szCs w:val="22"/>
-        </w:rPr>
-        <w:t xml:space="preserve">1. Double-click "KwikStore Pro-1.0.0-universal.dmg" (or your specific Intel / Apple Silicon .dmg file).</w:t>
+        <w:t xml:space="preserve">1.2 macOS Installation (.dmg) (Intel &amp; Apple Silicon M1/M2/M3/M4)</w:t>
+      </w:r>
+    </w:p>
+    <w:p>
+      <w:pPr>
+        <w:spacing w:after="80" w:before="80"/>
+      </w:pPr>
+      <w:r>
+        <w:rPr>
+          <w:rFonts w:ascii="Calibri" w:cs="Calibri" w:eastAsia="Calibri" w:hAnsi="Calibri"/>
+          <w:b w:val="false"/>
+          <w:bCs w:val="false"/>
+          <w:i w:val="false"/>
+          <w:iCs w:val="false"/>
+          <w:color w:val="1E293B"/>
+          <w:sz w:val="22"/>
+          <w:szCs w:val="22"/>
+        </w:rPr>
+        <w:t xml:space="preserve">1. Double-click "KwikStore Pro-1.1.0-arm64.dmg" (or your Intel .dmg file).</w:t>
       </w:r>
     </w:p>
     <w:p>
@@ -1210,25 +1297,25 @@
           <w:sz w:val="22"/>
           <w:szCs w:val="22"/>
         </w:rPr>
-        <w:t xml:space="preserve">2. Click "Copy ID" or click "WhatsApp Key Request" to message the seller (Rajesh: +91 8338833377).</w:t>
-      </w:r>
-    </w:p>
-    <w:p>
-      <w:pPr>
-        <w:spacing w:after="80" w:before="80"/>
-      </w:pPr>
-      <w:r>
-        <w:rPr>
-          <w:rFonts w:ascii="Calibri" w:cs="Calibri" w:eastAsia="Calibri" w:hAnsi="Calibri"/>
-          <w:b w:val="false"/>
-          <w:bCs w:val="false"/>
-          <w:i w:val="false"/>
-          <w:iCs w:val="false"/>
-          <w:color w:val="1E293B"/>
-          <w:sz w:val="22"/>
-          <w:szCs w:val="22"/>
-        </w:rPr>
-        <w:t xml:space="preserve">3. Enter your Shop Name and the genuine License Key (e.g. KWIK-1YE-XXXX-YYYY-ZZZZ) received from the seller.</w:t>
+        <w:t xml:space="preserve">2. Click "Copy ID" or click "WhatsApp Key Request" to message our support desk (+91 8338833377).</w:t>
+      </w:r>
+    </w:p>
+    <w:p>
+      <w:pPr>
+        <w:spacing w:after="80" w:before="80"/>
+      </w:pPr>
+      <w:r>
+        <w:rPr>
+          <w:rFonts w:ascii="Calibri" w:cs="Calibri" w:eastAsia="Calibri" w:hAnsi="Calibri"/>
+          <w:b w:val="false"/>
+          <w:bCs w:val="false"/>
+          <w:i w:val="false"/>
+          <w:iCs w:val="false"/>
+          <w:color w:val="1E293B"/>
+          <w:sz w:val="22"/>
+          <w:szCs w:val="22"/>
+        </w:rPr>
+        <w:t xml:space="preserve">3. Enter your Shop Name and the genuine License Key (e.g. KWIK-1YE-XXXX-YYYY-ZZZZ) received from us.</w:t>
       </w:r>
     </w:p>
     <w:p>
@@ -1264,7 +1351,7 @@
           <w:sz w:val="22"/>
           <w:szCs w:val="22"/>
         </w:rPr>
-        <w:t xml:space="preserve">5. Optional Free Trial: New buyers can click "Start 7-Day Free Trial" to evaluate all features before purchasing.</w:t>
+        <w:t xml:space="preserve">5. Free Trial: New buyers can click "Start 7-Day Free Trial" to evaluate all features before purchasing.</w:t>
       </w:r>
     </w:p>
     <w:p>
@@ -1382,7 +1469,7 @@
           <w:sz w:val="22"/>
           <w:szCs w:val="22"/>
         </w:rPr>
-        <w:t xml:space="preserve">Your official shop name (e.g., Pujarani Garments &amp; Footwear).</w:t>
+        <w:t xml:space="preserve">Your official shop name (e.g., Mahaveer Garments &amp; Footwear).</w:t>
       </w:r>
     </w:p>
     <w:p>
@@ -1407,7 +1494,7 @@
           <w:sz w:val="22"/>
           <w:szCs w:val="22"/>
         </w:rPr>
-        <w:t xml:space="preserve">Select your industry (Garments, Pharmacy, Hardware, Supermarket, or General Retail) for tailored invoicing presets.</w:t>
+        <w:t xml:space="preserve">Select your industry (Retail, Wholesale Distributor, Pharmacy, Garments, Hardware, Supermarket) for tailored presets.</w:t>
       </w:r>
     </w:p>
     <w:p>
@@ -1432,7 +1519,7 @@
           <w:sz w:val="22"/>
           <w:szCs w:val="22"/>
         </w:rPr>
-        <w:t xml:space="preserve">Your personal name and desired login username (e.g., pujarani.store).</w:t>
+        <w:t xml:space="preserve">Your personal name and desired login username (e.g., rajesh.store).</w:t>
       </w:r>
     </w:p>
     <w:p>
@@ -1636,7 +1723,7 @@
         </w:rPr>
       </w:pPr>
       <w:r>
-        <w:t xml:space="preserve">Chapter 3: First-Time Shop Profile &amp; GST Configuration</w:t>
+        <w:t xml:space="preserve">Chapter 3: First-Time Shop Profile, GST &amp; Rate Tier Configuration</w:t>
       </w:r>
     </w:p>
     <w:p>
@@ -1671,7 +1758,7 @@
         </w:rPr>
       </w:pPr>
       <w:r>
-        <w:t xml:space="preserve">3.1 Configuring Shop Details</w:t>
+        <w:t xml:space="preserve">3.1 Configuring Shop Details &amp; Multi-Sector Fields</w:t>
       </w:r>
     </w:p>
     <w:p>
@@ -1732,7 +1819,7 @@
           <w:sz w:val="22"/>
           <w:szCs w:val="22"/>
         </w:rPr>
-        <w:t xml:space="preserve">Your trade/business name (e.g., Mahaveer Garments &amp; Textiles)</w:t>
+        <w:t xml:space="preserve">Your trade/business name (e.g., Shree Balaji Enterprises)</w:t>
       </w:r>
     </w:p>
     <w:p>
@@ -1757,7 +1844,7 @@
           <w:sz w:val="22"/>
           <w:szCs w:val="22"/>
         </w:rPr>
-        <w:t xml:space="preserve">Your 15-digit GST Identification Number (e.g., 27ABCDE1234F1Z5)</w:t>
+        <w:t xml:space="preserve">Your 15-digit GST Identification Number (e.g., 21ABCDE1234F1Z5)</w:t>
       </w:r>
     </w:p>
     <w:p>
@@ -1782,7 +1869,7 @@
           <w:sz w:val="22"/>
           <w:szCs w:val="22"/>
         </w:rPr>
-        <w:t xml:space="preserve">Mandatory for Pharmacies/Medical Stores (e.g., DL-MH-12345/67890)</w:t>
+        <w:t xml:space="preserve">Mandatory for Medical Stores / Pharmacies (DL-20B / DL-21B)</w:t>
       </w:r>
     </w:p>
     <w:p>
@@ -1857,7 +1944,7 @@
           <w:sz w:val="22"/>
           <w:szCs w:val="22"/>
         </w:rPr>
-        <w:t xml:space="preserve">Your store GooglePay/PhonePe/Paytm UPI ID (e.g., shopname@okaxis or 9876543210@paytm) to automatically print Dynamic Payment QR codes on customer bills!</w:t>
+        <w:t xml:space="preserve">Your store GooglePay/PhonePe/Paytm UPI ID to automatically generate Dynamic Payment QR codes on bills!</w:t>
       </w:r>
     </w:p>
     <w:p>
@@ -1874,125 +1961,61 @@
         </w:rPr>
       </w:pPr>
       <w:r>
-        <w:t xml:space="preserve">3.2 1-Click Industry Terms &amp; Conditions Presets</w:t>
-      </w:r>
-    </w:p>
-    <w:p>
-      <w:pPr>
-        <w:spacing w:after="80" w:before="80"/>
-      </w:pPr>
-      <w:r>
-        <w:rPr>
-          <w:rFonts w:ascii="Calibri" w:cs="Calibri" w:eastAsia="Calibri" w:hAnsi="Calibri"/>
-          <w:b w:val="false"/>
-          <w:bCs w:val="false"/>
-          <w:i w:val="false"/>
-          <w:iCs w:val="false"/>
-          <w:color w:val="1E293B"/>
-          <w:sz w:val="22"/>
-          <w:szCs w:val="22"/>
-        </w:rPr>
-        <w:t xml:space="preserve">KwikStore Pro provides pre-written, legally compliant terms for different business sectors. Click any of the one-click preset buttons:</w:t>
-      </w:r>
-    </w:p>
-    <w:p>
-      <w:pPr>
-        <w:spacing w:after="60" w:before="60"/>
-      </w:pPr>
-      <w:r>
-        <w:rPr>
-          <w:rFonts w:ascii="Calibri" w:cs="Calibri" w:eastAsia="Calibri" w:hAnsi="Calibri"/>
-          <w:b/>
-          <w:bCs/>
-          <w:color w:val="005A9C"/>
-          <w:sz w:val="22"/>
-          <w:szCs w:val="22"/>
-        </w:rPr>
-        <w:t xml:space="preserve">• 👗 Garments Policy: </w:t>
-      </w:r>
-      <w:r>
-        <w:rPr>
-          <w:rFonts w:ascii="Calibri" w:cs="Calibri" w:eastAsia="Calibri" w:hAnsi="Calibri"/>
-          <w:color w:val="1E293B"/>
-          <w:sz w:val="22"/>
-          <w:szCs w:val="22"/>
-        </w:rPr>
-        <w:t xml:space="preserve">"Exchange allowed within 7 days with price tag and original bill intact. No cash refunds."</w:t>
-      </w:r>
-    </w:p>
-    <w:p>
-      <w:pPr>
-        <w:spacing w:after="60" w:before="60"/>
-      </w:pPr>
-      <w:r>
-        <w:rPr>
-          <w:rFonts w:ascii="Calibri" w:cs="Calibri" w:eastAsia="Calibri" w:hAnsi="Calibri"/>
-          <w:b/>
-          <w:bCs/>
-          <w:color w:val="005A9C"/>
-          <w:sz w:val="22"/>
-          <w:szCs w:val="22"/>
-        </w:rPr>
-        <w:t xml:space="preserve">• 💊 Pharmacy Rx Policy: </w:t>
-      </w:r>
-      <w:r>
-        <w:rPr>
-          <w:rFonts w:ascii="Calibri" w:cs="Calibri" w:eastAsia="Calibri" w:hAnsi="Calibri"/>
-          <w:color w:val="1E293B"/>
-          <w:sz w:val="22"/>
-          <w:szCs w:val="22"/>
-        </w:rPr>
-        <w:t xml:space="preserve">"Medicines once sold cannot be returned after 48 hrs. Schedule H drugs require doctor Rx."</w:t>
-      </w:r>
-    </w:p>
-    <w:p>
-      <w:pPr>
-        <w:spacing w:after="60" w:before="60"/>
-      </w:pPr>
-      <w:r>
-        <w:rPr>
-          <w:rFonts w:ascii="Calibri" w:cs="Calibri" w:eastAsia="Calibri" w:hAnsi="Calibri"/>
-          <w:b/>
-          <w:bCs/>
-          <w:color w:val="005A9C"/>
-          <w:sz w:val="22"/>
-          <w:szCs w:val="22"/>
-        </w:rPr>
-        <w:t xml:space="preserve">• 🔩 Hardware Policy: </w:t>
-      </w:r>
-      <w:r>
-        <w:rPr>
-          <w:rFonts w:ascii="Calibri" w:cs="Calibri" w:eastAsia="Calibri" w:hAnsi="Calibri"/>
-          <w:color w:val="1E293B"/>
-          <w:sz w:val="22"/>
-          <w:szCs w:val="22"/>
-        </w:rPr>
-        <w:t xml:space="preserve">"Cut pipes, electrical wires, and tinted paints cannot be returned. Interest 18% on overdue credit."</w:t>
-      </w:r>
-    </w:p>
-    <w:p>
-      <w:pPr>
-        <w:spacing w:after="60" w:before="60"/>
-      </w:pPr>
-      <w:r>
-        <w:rPr>
-          <w:rFonts w:ascii="Calibri" w:cs="Calibri" w:eastAsia="Calibri" w:hAnsi="Calibri"/>
-          <w:b/>
-          <w:bCs/>
-          <w:color w:val="005A9C"/>
-          <w:sz w:val="22"/>
-          <w:szCs w:val="22"/>
-        </w:rPr>
-        <w:t xml:space="preserve">• 🛒 Supermarket Policy: </w:t>
-      </w:r>
-      <w:r>
-        <w:rPr>
-          <w:rFonts w:ascii="Calibri" w:cs="Calibri" w:eastAsia="Calibri" w:hAnsi="Calibri"/>
-          <w:color w:val="1E293B"/>
-          <w:sz w:val="22"/>
-          <w:szCs w:val="22"/>
-        </w:rPr>
-        <w:t xml:space="preserve">"Goods once sold can only be exchanged within 3 days in sealed condition with invoice."</w:t>
+        <w:t xml:space="preserve">3.2 Distributor &amp; Multi-Tier Pricing (Retail, Wholesale, Dealer, MRP)</w:t>
+      </w:r>
+    </w:p>
+    <w:p>
+      <w:pPr>
+        <w:spacing w:after="80" w:before="80"/>
+      </w:pPr>
+      <w:r>
+        <w:rPr>
+          <w:rFonts w:ascii="Calibri" w:cs="Calibri" w:eastAsia="Calibri" w:hAnsi="Calibri"/>
+          <w:b w:val="false"/>
+          <w:bCs w:val="false"/>
+          <w:i w:val="false"/>
+          <w:iCs w:val="false"/>
+          <w:color w:val="1E293B"/>
+          <w:sz w:val="22"/>
+          <w:szCs w:val="22"/>
+        </w:rPr>
+        <w:t xml:space="preserve">If your business operates as a Wholesale Distributor or sells at multiple price points:</w:t>
+      </w:r>
+    </w:p>
+    <w:p>
+      <w:pPr>
+        <w:spacing w:after="80" w:before="80"/>
+      </w:pPr>
+      <w:r>
+        <w:rPr>
+          <w:rFonts w:ascii="Calibri" w:cs="Calibri" w:eastAsia="Calibri" w:hAnsi="Calibri"/>
+          <w:b w:val="false"/>
+          <w:bCs w:val="false"/>
+          <w:i w:val="false"/>
+          <w:iCs w:val="false"/>
+          <w:color w:val="1E293B"/>
+          <w:sz w:val="22"/>
+          <w:szCs w:val="22"/>
+        </w:rPr>
+        <w:t xml:space="preserve">• KwikStore Pro supports 4 distinct price tiers for every product: RETAIL, WHOLESALE, DEALER, and MRP.</w:t>
+      </w:r>
+    </w:p>
+    <w:p>
+      <w:pPr>
+        <w:spacing w:after="80" w:before="80"/>
+      </w:pPr>
+      <w:r>
+        <w:rPr>
+          <w:rFonts w:ascii="Calibri" w:cs="Calibri" w:eastAsia="Calibri" w:hAnsi="Calibri"/>
+          <w:b w:val="false"/>
+          <w:bCs w:val="false"/>
+          <w:i w:val="false"/>
+          <w:iCs w:val="false"/>
+          <w:color w:val="1E293B"/>
+          <w:sz w:val="22"/>
+          <w:szCs w:val="22"/>
+        </w:rPr>
+        <w:t xml:space="preserve">• During POS billing, simply select the customer's rate tier from the top rate selector (or set it automatically per customer type). The POS will instantly recalculate line item rates, margins, and taxes!</w:t>
       </w:r>
     </w:p>
     <w:p>
@@ -2009,25 +2032,25 @@
         </w:rPr>
       </w:pPr>
       <w:r>
-        <w:t xml:space="preserve">3.3 Printer Format &amp; Invoicing Settings</w:t>
-      </w:r>
-    </w:p>
-    <w:p>
-      <w:pPr>
-        <w:spacing w:after="80" w:before="80"/>
-      </w:pPr>
-      <w:r>
-        <w:rPr>
-          <w:rFonts w:ascii="Calibri" w:cs="Calibri" w:eastAsia="Calibri" w:hAnsi="Calibri"/>
-          <w:b w:val="false"/>
-          <w:bCs w:val="false"/>
-          <w:i w:val="false"/>
-          <w:iCs w:val="false"/>
-          <w:color w:val="1E293B"/>
-          <w:sz w:val="22"/>
-          <w:szCs w:val="22"/>
-        </w:rPr>
-        <w:t xml:space="preserve">Choose your preferred default invoice printing layout:</w:t>
+        <w:t xml:space="preserve">3.3 1-Click Industry Terms &amp; Conditions Presets</w:t>
+      </w:r>
+    </w:p>
+    <w:p>
+      <w:pPr>
+        <w:spacing w:after="80" w:before="80"/>
+      </w:pPr>
+      <w:r>
+        <w:rPr>
+          <w:rFonts w:ascii="Calibri" w:cs="Calibri" w:eastAsia="Calibri" w:hAnsi="Calibri"/>
+          <w:b w:val="false"/>
+          <w:bCs w:val="false"/>
+          <w:i w:val="false"/>
+          <w:iCs w:val="false"/>
+          <w:color w:val="1E293B"/>
+          <w:sz w:val="22"/>
+          <w:szCs w:val="22"/>
+        </w:rPr>
+        <w:t xml:space="preserve">KwikStore Pro provides pre-written, legally compliant terms for different business sectors:</w:t>
       </w:r>
     </w:p>
     <w:p>
@@ -2043,16 +2066,16 @@
           <w:sz w:val="22"/>
           <w:szCs w:val="22"/>
         </w:rPr>
-        <w:t xml:space="preserve">• 80mm / 3-Inch Thermal Receipt: </w:t>
-      </w:r>
-      <w:r>
-        <w:rPr>
-          <w:rFonts w:ascii="Calibri" w:cs="Calibri" w:eastAsia="Calibri" w:hAnsi="Calibri"/>
-          <w:color w:val="1E293B"/>
-          <w:sz w:val="22"/>
-          <w:szCs w:val="22"/>
-        </w:rPr>
-        <w:t xml:space="preserve">Standard retail POS receipt for fast checkout with Auto-Cut support.</w:t>
+        <w:t xml:space="preserve">• 👗 Garments Policy: </w:t>
+      </w:r>
+      <w:r>
+        <w:rPr>
+          <w:rFonts w:ascii="Calibri" w:cs="Calibri" w:eastAsia="Calibri" w:hAnsi="Calibri"/>
+          <w:color w:val="1E293B"/>
+          <w:sz w:val="22"/>
+          <w:szCs w:val="22"/>
+        </w:rPr>
+        <w:t xml:space="preserve">"Exchange allowed within 7 days with price tag and original bill intact. No cash refunds."</w:t>
       </w:r>
     </w:p>
     <w:p>
@@ -2068,16 +2091,16 @@
           <w:sz w:val="22"/>
           <w:szCs w:val="22"/>
         </w:rPr>
-        <w:t xml:space="preserve">• 58mm / 2-Inch Thermal Receipt: </w:t>
-      </w:r>
-      <w:r>
-        <w:rPr>
-          <w:rFonts w:ascii="Calibri" w:cs="Calibri" w:eastAsia="Calibri" w:hAnsi="Calibri"/>
-          <w:color w:val="1E293B"/>
-          <w:sz w:val="22"/>
-          <w:szCs w:val="22"/>
-        </w:rPr>
-        <w:t xml:space="preserve">Compact mini-receipt for mobile/portable handheld printers.</w:t>
+        <w:t xml:space="preserve">• 💊 Pharmacy Policy: </w:t>
+      </w:r>
+      <w:r>
+        <w:rPr>
+          <w:rFonts w:ascii="Calibri" w:cs="Calibri" w:eastAsia="Calibri" w:hAnsi="Calibri"/>
+          <w:color w:val="1E293B"/>
+          <w:sz w:val="22"/>
+          <w:szCs w:val="22"/>
+        </w:rPr>
+        <w:t xml:space="preserve">"Medicines once sold cannot be returned after 48 hrs. Schedule H/H1 drugs require doctor prescription."</w:t>
       </w:r>
     </w:p>
     <w:p>
@@ -2093,16 +2116,41 @@
           <w:sz w:val="22"/>
           <w:szCs w:val="22"/>
         </w:rPr>
-        <w:t xml:space="preserve">• A4 Full Tax Invoice: </w:t>
-      </w:r>
-      <w:r>
-        <w:rPr>
-          <w:rFonts w:ascii="Calibri" w:cs="Calibri" w:eastAsia="Calibri" w:hAnsi="Calibri"/>
-          <w:color w:val="1E293B"/>
-          <w:sz w:val="22"/>
-          <w:szCs w:val="22"/>
-        </w:rPr>
-        <w:t xml:space="preserve">Full-page GST tax invoice formatted for B2B wholesale, distributions, and deliveries.</w:t>
+        <w:t xml:space="preserve">• 🔩 Hardware Policy: </w:t>
+      </w:r>
+      <w:r>
+        <w:rPr>
+          <w:rFonts w:ascii="Calibri" w:cs="Calibri" w:eastAsia="Calibri" w:hAnsi="Calibri"/>
+          <w:color w:val="1E293B"/>
+          <w:sz w:val="22"/>
+          <w:szCs w:val="22"/>
+        </w:rPr>
+        <w:t xml:space="preserve">"Cut pipes, electrical wires, and tinted paints cannot be returned. Interest 18% on overdue credit."</w:t>
+      </w:r>
+    </w:p>
+    <w:p>
+      <w:pPr>
+        <w:spacing w:after="60" w:before="60"/>
+      </w:pPr>
+      <w:r>
+        <w:rPr>
+          <w:rFonts w:ascii="Calibri" w:cs="Calibri" w:eastAsia="Calibri" w:hAnsi="Calibri"/>
+          <w:b/>
+          <w:bCs/>
+          <w:color w:val="005A9C"/>
+          <w:sz w:val="22"/>
+          <w:szCs w:val="22"/>
+        </w:rPr>
+        <w:t xml:space="preserve">• 📦 Wholesale Policy: </w:t>
+      </w:r>
+      <w:r>
+        <w:rPr>
+          <w:rFonts w:ascii="Calibri" w:cs="Calibri" w:eastAsia="Calibri" w:hAnsi="Calibri"/>
+          <w:color w:val="1E293B"/>
+          <w:sz w:val="22"/>
+          <w:szCs w:val="22"/>
+        </w:rPr>
+        <w:t xml:space="preserve">"Goods dispatched at buyer's risk. Claims for shortage must be reported within 24 hours."</w:t>
       </w:r>
     </w:p>
     <w:p>
@@ -2124,25 +2172,25 @@
         </w:rPr>
       </w:pPr>
       <w:r>
-        <w:t xml:space="preserve">Chapter 4: Staff Management &amp; Role-Based Access Control</w:t>
-      </w:r>
-    </w:p>
-    <w:p>
-      <w:pPr>
-        <w:spacing w:after="80" w:before="80"/>
-      </w:pPr>
-      <w:r>
-        <w:rPr>
-          <w:rFonts w:ascii="Calibri" w:cs="Calibri" w:eastAsia="Calibri" w:hAnsi="Calibri"/>
-          <w:b w:val="false"/>
-          <w:bCs w:val="false"/>
-          <w:i w:val="false"/>
-          <w:iCs w:val="false"/>
-          <w:color w:val="1E293B"/>
-          <w:sz w:val="22"/>
-          <w:szCs w:val="22"/>
-        </w:rPr>
-        <w:t xml:space="preserve">KwikStore Pro supports multi-user staff security so you can hire cashiers and counter operators without giving them access to confidential profit margins, financial reports, or store settings.</w:t>
+        <w:t xml:space="preserve">Chapter 4: Hardware &amp; Multi-Counter LAN System</w:t>
+      </w:r>
+    </w:p>
+    <w:p>
+      <w:pPr>
+        <w:spacing w:after="80" w:before="80"/>
+      </w:pPr>
+      <w:r>
+        <w:rPr>
+          <w:rFonts w:ascii="Calibri" w:cs="Calibri" w:eastAsia="Calibri" w:hAnsi="Calibri"/>
+          <w:b w:val="false"/>
+          <w:bCs w:val="false"/>
+          <w:i w:val="false"/>
+          <w:iCs w:val="false"/>
+          <w:color w:val="1E293B"/>
+          <w:sz w:val="22"/>
+          <w:szCs w:val="22"/>
+        </w:rPr>
+        <w:t xml:space="preserve">KwikStore Pro includes a built-in Hardware &amp; LAN Diagnostics Hub accessible right from the top navigation bar. It automatically discovers and initializes your shop hardware:</w:t>
       </w:r>
     </w:p>
     <w:p>
@@ -2159,7 +2207,632 @@
         </w:rPr>
       </w:pPr>
       <w:r>
-        <w:t xml:space="preserve">4.1 User Roles in KwikStore Pro</w:t>
+        <w:t xml:space="preserve">4.1 Multi-Counter LAN Discovery &amp; Master Server Setup</w:t>
+      </w:r>
+    </w:p>
+    <w:p>
+      <w:pPr>
+        <w:spacing w:after="80" w:before="80"/>
+      </w:pPr>
+      <w:r>
+        <w:rPr>
+          <w:rFonts w:ascii="Calibri" w:cs="Calibri" w:eastAsia="Calibri" w:hAnsi="Calibri"/>
+          <w:b w:val="false"/>
+          <w:bCs w:val="false"/>
+          <w:i w:val="false"/>
+          <w:iCs w:val="false"/>
+          <w:color w:val="1E293B"/>
+          <w:sz w:val="22"/>
+          <w:szCs w:val="22"/>
+        </w:rPr>
+        <w:t xml:space="preserve">You can connect multiple PCs, laptops, or Android/iOS tablets in your shop over local Wi-Fi or LAN without any cloud server fees:</w:t>
+      </w:r>
+    </w:p>
+    <w:p>
+      <w:pPr>
+        <w:spacing w:after="80" w:before="80"/>
+      </w:pPr>
+      <w:r>
+        <w:rPr>
+          <w:rFonts w:ascii="Calibri" w:cs="Calibri" w:eastAsia="Calibri" w:hAnsi="Calibri"/>
+          <w:b w:val="false"/>
+          <w:bCs w:val="false"/>
+          <w:i w:val="false"/>
+          <w:iCs w:val="false"/>
+          <w:color w:val="1E293B"/>
+          <w:sz w:val="22"/>
+          <w:szCs w:val="22"/>
+        </w:rPr>
+        <w:t xml:space="preserve">1. Master Server (Main PC): Keep System Mode = "Master Host (Host Server &amp; Database)". The app auto-detects its local LAN IP (e.g. http://192.168.1.50:4848).</w:t>
+      </w:r>
+    </w:p>
+    <w:p>
+      <w:pPr>
+        <w:spacing w:after="80" w:before="80"/>
+      </w:pPr>
+      <w:r>
+        <w:rPr>
+          <w:rFonts w:ascii="Calibri" w:cs="Calibri" w:eastAsia="Calibri" w:hAnsi="Calibri"/>
+          <w:b w:val="false"/>
+          <w:bCs w:val="false"/>
+          <w:i w:val="false"/>
+          <w:iCs w:val="false"/>
+          <w:color w:val="1E293B"/>
+          <w:sz w:val="22"/>
+          <w:szCs w:val="22"/>
+        </w:rPr>
+        <w:t xml:space="preserve">2. Counter Terminals (Satellite PCs): Open their browser or KwikStore client, set System Mode = "Secondary Counter", and enter the Host IP address.</w:t>
+      </w:r>
+    </w:p>
+    <w:p>
+      <w:pPr>
+        <w:spacing w:after="80" w:before="80"/>
+      </w:pPr>
+      <w:r>
+        <w:rPr>
+          <w:rFonts w:ascii="Calibri" w:cs="Calibri" w:eastAsia="Calibri" w:hAnsi="Calibri"/>
+          <w:b w:val="false"/>
+          <w:bCs w:val="false"/>
+          <w:i w:val="false"/>
+          <w:iCs w:val="false"/>
+          <w:color w:val="1E293B"/>
+          <w:sz w:val="22"/>
+          <w:szCs w:val="22"/>
+        </w:rPr>
+        <w:t xml:space="preserve">3. Live Counter Registry: The master server automatically tracks every active terminal with live heartbeat and ping latency (ms).</w:t>
+      </w:r>
+    </w:p>
+    <w:p>
+      <w:pPr>
+        <w:spacing w:after="80" w:before="80"/>
+      </w:pPr>
+      <w:r>
+        <w:rPr>
+          <w:rFonts w:ascii="Calibri" w:cs="Calibri" w:eastAsia="Calibri" w:hAnsi="Calibri"/>
+          <w:b w:val="false"/>
+          <w:bCs w:val="false"/>
+          <w:i w:val="false"/>
+          <w:iCs w:val="false"/>
+          <w:color w:val="1E293B"/>
+          <w:sz w:val="22"/>
+          <w:szCs w:val="22"/>
+        </w:rPr>
+        <w:t xml:space="preserve">4. 1-Click Copy URL: Click "Copy URL" in the Hardware Hub to quickly share the connection link across the shop.</w:t>
+      </w:r>
+    </w:p>
+    <w:p>
+      <w:pPr>
+        <w:pStyle w:val="Heading2"/>
+        <w:spacing w:after="120" w:before="280"/>
+        <w:rPr>
+          <w:rFonts w:ascii="Calibri" w:cs="Calibri" w:eastAsia="Calibri" w:hAnsi="Calibri"/>
+          <w:b/>
+          <w:bCs/>
+          <w:color w:val="008080"/>
+          <w:sz w:val="26"/>
+          <w:szCs w:val="26"/>
+        </w:rPr>
+      </w:pPr>
+      <w:r>
+        <w:t xml:space="preserve">4.2 Thermal POS &amp; Laser A4 Printer Driver Initialization</w:t>
+      </w:r>
+    </w:p>
+    <w:p>
+      <w:pPr>
+        <w:spacing w:after="80" w:before="80"/>
+      </w:pPr>
+      <w:r>
+        <w:rPr>
+          <w:rFonts w:ascii="Calibri" w:cs="Calibri" w:eastAsia="Calibri" w:hAnsi="Calibri"/>
+          <w:b w:val="false"/>
+          <w:bCs w:val="false"/>
+          <w:i w:val="false"/>
+          <w:iCs w:val="false"/>
+          <w:color w:val="1E293B"/>
+          <w:sz w:val="22"/>
+          <w:szCs w:val="22"/>
+        </w:rPr>
+        <w:t xml:space="preserve">KwikStore Pro talks directly to your system print spooler and physical printers:</w:t>
+      </w:r>
+    </w:p>
+    <w:p>
+      <w:pPr>
+        <w:spacing w:after="80" w:before="80"/>
+      </w:pPr>
+      <w:r>
+        <w:rPr>
+          <w:rFonts w:ascii="Calibri" w:cs="Calibri" w:eastAsia="Calibri" w:hAnsi="Calibri"/>
+          <w:b w:val="false"/>
+          <w:bCs w:val="false"/>
+          <w:i w:val="false"/>
+          <w:iCs w:val="false"/>
+          <w:color w:val="1E293B"/>
+          <w:sz w:val="22"/>
+          <w:szCs w:val="22"/>
+        </w:rPr>
+        <w:t xml:space="preserve">1. Auto-Detection: Connected USB, Network, and Bluetooth printers (TVS RP3200, EPSON TM-T82, HP LaserJet, Canon, POS-80) are detected on launch.</w:t>
+      </w:r>
+    </w:p>
+    <w:p>
+      <w:pPr>
+        <w:spacing w:after="80" w:before="80"/>
+      </w:pPr>
+      <w:r>
+        <w:rPr>
+          <w:rFonts w:ascii="Calibri" w:cs="Calibri" w:eastAsia="Calibri" w:hAnsi="Calibri"/>
+          <w:b w:val="false"/>
+          <w:bCs w:val="false"/>
+          <w:i w:val="false"/>
+          <w:iCs w:val="false"/>
+          <w:color w:val="1E293B"/>
+          <w:sz w:val="22"/>
+          <w:szCs w:val="22"/>
+        </w:rPr>
+        <w:t xml:space="preserve">2. Dual Target Assignment:</w:t>
+      </w:r>
+    </w:p>
+    <w:p>
+      <w:pPr>
+        <w:spacing w:after="60" w:before="60"/>
+      </w:pPr>
+      <w:r>
+        <w:rPr>
+          <w:rFonts w:ascii="Calibri" w:cs="Calibri" w:eastAsia="Calibri" w:hAnsi="Calibri"/>
+          <w:b/>
+          <w:bCs/>
+          <w:color w:val="005A9C"/>
+          <w:sz w:val="22"/>
+          <w:szCs w:val="22"/>
+        </w:rPr>
+        <w:t xml:space="preserve">• POS Thermal Printer: </w:t>
+      </w:r>
+      <w:r>
+        <w:rPr>
+          <w:rFonts w:ascii="Calibri" w:cs="Calibri" w:eastAsia="Calibri" w:hAnsi="Calibri"/>
+          <w:color w:val="1E293B"/>
+          <w:sz w:val="22"/>
+          <w:szCs w:val="22"/>
+        </w:rPr>
+        <w:t xml:space="preserve">Select your 80mm or 58mm thermal receipt printer.</w:t>
+      </w:r>
+    </w:p>
+    <w:p>
+      <w:pPr>
+        <w:spacing w:after="60" w:before="60"/>
+      </w:pPr>
+      <w:r>
+        <w:rPr>
+          <w:rFonts w:ascii="Calibri" w:cs="Calibri" w:eastAsia="Calibri" w:hAnsi="Calibri"/>
+          <w:b/>
+          <w:bCs/>
+          <w:color w:val="005A9C"/>
+          <w:sz w:val="22"/>
+          <w:szCs w:val="22"/>
+        </w:rPr>
+        <w:t xml:space="preserve">• A4 Laser Invoice Printer: </w:t>
+      </w:r>
+      <w:r>
+        <w:rPr>
+          <w:rFonts w:ascii="Calibri" w:cs="Calibri" w:eastAsia="Calibri" w:hAnsi="Calibri"/>
+          <w:color w:val="1E293B"/>
+          <w:sz w:val="22"/>
+          <w:szCs w:val="22"/>
+        </w:rPr>
+        <w:t xml:space="preserve">Select your A4 printer for full tax invoices &amp; Delivery Challans.</w:t>
+      </w:r>
+    </w:p>
+    <w:p>
+      <w:pPr>
+        <w:spacing w:after="80" w:before="80"/>
+      </w:pPr>
+      <w:r>
+        <w:rPr>
+          <w:rFonts w:ascii="Calibri" w:cs="Calibri" w:eastAsia="Calibri" w:hAnsi="Calibri"/>
+          <w:b w:val="false"/>
+          <w:bCs w:val="false"/>
+          <w:i w:val="false"/>
+          <w:iCs w:val="false"/>
+          <w:color w:val="1E293B"/>
+          <w:sz w:val="22"/>
+          <w:szCs w:val="22"/>
+        </w:rPr>
+        <w:t xml:space="preserve">3. Test Print Slip: Click "Print 80mm Test Slip" in the Hardware Hub to verify driver alignment, text clarity, and auto-cutter.</w:t>
+      </w:r>
+    </w:p>
+    <w:p>
+      <w:pPr>
+        <w:spacing w:after="80" w:before="80"/>
+      </w:pPr>
+      <w:r>
+        <w:rPr>
+          <w:rFonts w:ascii="Calibri" w:cs="Calibri" w:eastAsia="Calibri" w:hAnsi="Calibri"/>
+          <w:b w:val="false"/>
+          <w:bCs w:val="false"/>
+          <w:i w:val="false"/>
+          <w:iCs w:val="false"/>
+          <w:color w:val="1E293B"/>
+          <w:sz w:val="22"/>
+          <w:szCs w:val="22"/>
+        </w:rPr>
+        <w:t xml:space="preserve">4. RJ-11 Cash Drawer Kick: Click "Test RJ11 Cash Drawer Kick" to send an electronic pulse signal that automatically pops open your connected cash drawer.</w:t>
+      </w:r>
+    </w:p>
+    <w:p>
+      <w:pPr>
+        <w:pStyle w:val="Heading2"/>
+        <w:spacing w:after="120" w:before="280"/>
+        <w:rPr>
+          <w:rFonts w:ascii="Calibri" w:cs="Calibri" w:eastAsia="Calibri" w:hAnsi="Calibri"/>
+          <w:b/>
+          <w:bCs/>
+          <w:color w:val="008080"/>
+          <w:sz w:val="26"/>
+          <w:szCs w:val="26"/>
+        </w:rPr>
+      </w:pPr>
+      <w:r>
+        <w:t xml:space="preserve">4.3 USB HID &amp; Wireless Barcode Scanner Driver</w:t>
+      </w:r>
+    </w:p>
+    <w:p>
+      <w:pPr>
+        <w:spacing w:after="80" w:before="80"/>
+      </w:pPr>
+      <w:r>
+        <w:rPr>
+          <w:rFonts w:ascii="Calibri" w:cs="Calibri" w:eastAsia="Calibri" w:hAnsi="Calibri"/>
+          <w:b w:val="false"/>
+          <w:bCs w:val="false"/>
+          <w:i w:val="false"/>
+          <w:iCs w:val="false"/>
+          <w:color w:val="1E293B"/>
+          <w:sz w:val="22"/>
+          <w:szCs w:val="22"/>
+        </w:rPr>
+        <w:t xml:space="preserve">KwikStore Pro features plug-and-play support for all standard 1D Laser and 2D QR barcode guns:</w:t>
+      </w:r>
+    </w:p>
+    <w:p>
+      <w:pPr>
+        <w:spacing w:after="80" w:before="80"/>
+      </w:pPr>
+      <w:r>
+        <w:rPr>
+          <w:rFonts w:ascii="Calibri" w:cs="Calibri" w:eastAsia="Calibri" w:hAnsi="Calibri"/>
+          <w:b w:val="false"/>
+          <w:bCs w:val="false"/>
+          <w:i w:val="false"/>
+          <w:iCs w:val="false"/>
+          <w:color w:val="1E293B"/>
+          <w:sz w:val="22"/>
+          <w:szCs w:val="22"/>
+        </w:rPr>
+        <w:t xml:space="preserve">1. Plug &amp; Play: Simply plug your USB barcode scanner into any USB port. No manual driver installation needed.</w:t>
+      </w:r>
+    </w:p>
+    <w:p>
+      <w:pPr>
+        <w:spacing w:after="80" w:before="80"/>
+      </w:pPr>
+      <w:r>
+        <w:rPr>
+          <w:rFonts w:ascii="Calibri" w:cs="Calibri" w:eastAsia="Calibri" w:hAnsi="Calibri"/>
+          <w:b w:val="false"/>
+          <w:bCs w:val="false"/>
+          <w:i w:val="false"/>
+          <w:iCs w:val="false"/>
+          <w:color w:val="1E293B"/>
+          <w:sz w:val="22"/>
+          <w:szCs w:val="22"/>
+        </w:rPr>
+        <w:t xml:space="preserve">2. High-Speed Burst Detector: The system listens globally for rapid keystroke pulses (&lt; 35ms) sent by barcode scanners and automatically adds the scanned product to the cart from any screen!</w:t>
+      </w:r>
+    </w:p>
+    <w:p>
+      <w:pPr>
+        <w:spacing w:after="80" w:before="80"/>
+      </w:pPr>
+      <w:r>
+        <w:rPr>
+          <w:rFonts w:ascii="Calibri" w:cs="Calibri" w:eastAsia="Calibri" w:hAnsi="Calibri"/>
+          <w:b w:val="false"/>
+          <w:bCs w:val="false"/>
+          <w:i w:val="false"/>
+          <w:iCs w:val="false"/>
+          <w:color w:val="1E293B"/>
+          <w:sz w:val="22"/>
+          <w:szCs w:val="22"/>
+        </w:rPr>
+        <w:t xml:space="preserve">3. Scanner Diagnostic Box: Use the physical scanner test box in the Hardware Hub to test scan speeds, verify decoded characters, and detect symbologies (EAN-13, Code 128, QR Code).</w:t>
+      </w:r>
+    </w:p>
+    <w:p>
+      <w:pPr>
+        <w:spacing w:after="80" w:before="80"/>
+      </w:pPr>
+      <w:r>
+        <w:rPr>
+          <w:rFonts w:ascii="Calibri" w:cs="Calibri" w:eastAsia="Calibri" w:hAnsi="Calibri"/>
+          <w:b w:val="false"/>
+          <w:bCs w:val="false"/>
+          <w:i w:val="false"/>
+          <w:iCs w:val="false"/>
+          <w:color w:val="1E293B"/>
+          <w:sz w:val="22"/>
+          <w:szCs w:val="22"/>
+        </w:rPr>
+        <w:t xml:space="preserve">4. Scanner Simulator: Test with 1-click simulation buttons (Tata Salt, Maggi Noodles, Dettol Soap) even if you don't have a physical scanner on hand.</w:t>
+      </w:r>
+    </w:p>
+    <w:p>
+      <w:pPr>
+        <w:pStyle w:val="Heading2"/>
+        <w:spacing w:after="120" w:before="280"/>
+        <w:rPr>
+          <w:rFonts w:ascii="Calibri" w:cs="Calibri" w:eastAsia="Calibri" w:hAnsi="Calibri"/>
+          <w:b/>
+          <w:bCs/>
+          <w:color w:val="008080"/>
+          <w:sz w:val="26"/>
+          <w:szCs w:val="26"/>
+        </w:rPr>
+      </w:pPr>
+      <w:r>
+        <w:t xml:space="preserve">4.4 Electronic Weighing Scale Integration (RS-232 / USB Serial)</w:t>
+      </w:r>
+    </w:p>
+    <w:p>
+      <w:pPr>
+        <w:spacing w:after="80" w:before="80"/>
+      </w:pPr>
+      <w:r>
+        <w:rPr>
+          <w:rFonts w:ascii="Calibri" w:cs="Calibri" w:eastAsia="Calibri" w:hAnsi="Calibri"/>
+          <w:b w:val="false"/>
+          <w:bCs w:val="false"/>
+          <w:i w:val="false"/>
+          <w:iCs w:val="false"/>
+          <w:color w:val="1E293B"/>
+          <w:sz w:val="22"/>
+          <w:szCs w:val="22"/>
+        </w:rPr>
+        <w:t xml:space="preserve">For Grocery, Fruits, Vegetables, Meat, Dry Fruits, and Sweet shops, KwikStore Pro connects directly with electronic weighing scales:</w:t>
+      </w:r>
+    </w:p>
+    <w:p>
+      <w:pPr>
+        <w:spacing w:after="80" w:before="80"/>
+      </w:pPr>
+      <w:r>
+        <w:rPr>
+          <w:rFonts w:ascii="Calibri" w:cs="Calibri" w:eastAsia="Calibri" w:hAnsi="Calibri"/>
+          <w:b w:val="false"/>
+          <w:bCs w:val="false"/>
+          <w:i w:val="false"/>
+          <w:iCs w:val="false"/>
+          <w:color w:val="1E293B"/>
+          <w:sz w:val="22"/>
+          <w:szCs w:val="22"/>
+        </w:rPr>
+        <w:t xml:space="preserve">1. Serial Port Connection: Connect your scale to your PC via RS-232 / USB Serial port (Essae, CAS, Phoenix, Citizen, Sansui, Toledo).</w:t>
+      </w:r>
+    </w:p>
+    <w:p>
+      <w:pPr>
+        <w:spacing w:after="80" w:before="80"/>
+      </w:pPr>
+      <w:r>
+        <w:rPr>
+          <w:rFonts w:ascii="Calibri" w:cs="Calibri" w:eastAsia="Calibri" w:hAnsi="Calibri"/>
+          <w:b w:val="false"/>
+          <w:bCs w:val="false"/>
+          <w:i w:val="false"/>
+          <w:iCs w:val="false"/>
+          <w:color w:val="1E293B"/>
+          <w:sz w:val="22"/>
+          <w:szCs w:val="22"/>
+        </w:rPr>
+        <w:t xml:space="preserve">2. Live LED Weight Meter: The Hardware Hub displays the live weight reading in real-time with stability indicators (STABLE / STABILIZING).</w:t>
+      </w:r>
+    </w:p>
+    <w:p>
+      <w:pPr>
+        <w:spacing w:after="80" w:before="80"/>
+      </w:pPr>
+      <w:r>
+        <w:rPr>
+          <w:rFonts w:ascii="Calibri" w:cs="Calibri" w:eastAsia="Calibri" w:hAnsi="Calibri"/>
+          <w:b w:val="false"/>
+          <w:bCs w:val="false"/>
+          <w:i w:val="false"/>
+          <w:iCs w:val="false"/>
+          <w:color w:val="1E293B"/>
+          <w:sz w:val="22"/>
+          <w:szCs w:val="22"/>
+        </w:rPr>
+        <w:t xml:space="preserve">3. 1-Click Weight Capture: During POS billing, click the "⚖️" scale button next to any item quantity to instantly pull the live scale weight into the bill!</w:t>
+      </w:r>
+    </w:p>
+    <w:p>
+      <w:pPr>
+        <w:spacing w:after="80" w:before="80"/>
+      </w:pPr>
+      <w:r>
+        <w:rPr>
+          <w:rFonts w:ascii="Calibri" w:cs="Calibri" w:eastAsia="Calibri" w:hAnsi="Calibri"/>
+          <w:b w:val="false"/>
+          <w:bCs w:val="false"/>
+          <w:i w:val="false"/>
+          <w:iCs w:val="false"/>
+          <w:color w:val="1E293B"/>
+          <w:sz w:val="22"/>
+          <w:szCs w:val="22"/>
+        </w:rPr>
+        <w:t xml:space="preserve">4. Tare &amp; Zero: Use the built-in Tare (T) button in the Hardware Hub to subtract container or packaging weights.</w:t>
+      </w:r>
+    </w:p>
+    <w:p>
+      <w:pPr>
+        <w:pStyle w:val="Heading2"/>
+        <w:spacing w:after="120" w:before="280"/>
+        <w:rPr>
+          <w:rFonts w:ascii="Calibri" w:cs="Calibri" w:eastAsia="Calibri" w:hAnsi="Calibri"/>
+          <w:b/>
+          <w:bCs/>
+          <w:color w:val="008080"/>
+          <w:sz w:val="26"/>
+          <w:szCs w:val="26"/>
+        </w:rPr>
+      </w:pPr>
+      <w:r>
+        <w:t xml:space="preserve">4.5 Dual-Screen Customer Facing Display (CFD)</w:t>
+      </w:r>
+    </w:p>
+    <w:p>
+      <w:pPr>
+        <w:spacing w:after="80" w:before="80"/>
+      </w:pPr>
+      <w:r>
+        <w:rPr>
+          <w:rFonts w:ascii="Calibri" w:cs="Calibri" w:eastAsia="Calibri" w:hAnsi="Calibri"/>
+          <w:b w:val="false"/>
+          <w:bCs w:val="false"/>
+          <w:i w:val="false"/>
+          <w:iCs w:val="false"/>
+          <w:color w:val="1E293B"/>
+          <w:sz w:val="22"/>
+          <w:szCs w:val="22"/>
+        </w:rPr>
+        <w:t xml:space="preserve">Elevate your store's customer experience with a dedicated secondary monitor or tablet mounted at the billing counter:</w:t>
+      </w:r>
+    </w:p>
+    <w:p>
+      <w:pPr>
+        <w:spacing w:after="80" w:before="80"/>
+      </w:pPr>
+      <w:r>
+        <w:rPr>
+          <w:rFonts w:ascii="Calibri" w:cs="Calibri" w:eastAsia="Calibri" w:hAnsi="Calibri"/>
+          <w:b w:val="false"/>
+          <w:bCs w:val="false"/>
+          <w:i w:val="false"/>
+          <w:iCs w:val="false"/>
+          <w:color w:val="1E293B"/>
+          <w:sz w:val="22"/>
+          <w:szCs w:val="22"/>
+        </w:rPr>
+        <w:t xml:space="preserve">1. Open CFD: Click "CFD Screen" in the top navbar or open http://&lt;Master_IP&gt;:4848/customer-display on any customer-facing monitor or tablet.</w:t>
+      </w:r>
+    </w:p>
+    <w:p>
+      <w:pPr>
+        <w:spacing w:after="80" w:before="80"/>
+      </w:pPr>
+      <w:r>
+        <w:rPr>
+          <w:rFonts w:ascii="Calibri" w:cs="Calibri" w:eastAsia="Calibri" w:hAnsi="Calibri"/>
+          <w:b w:val="false"/>
+          <w:bCs w:val="false"/>
+          <w:i w:val="false"/>
+          <w:iCs w:val="false"/>
+          <w:color w:val="1E293B"/>
+          <w:sz w:val="22"/>
+          <w:szCs w:val="22"/>
+        </w:rPr>
+        <w:t xml:space="preserve">2. Idle State: Displays your official store logo, greeting message, and promotional offer banners.</w:t>
+      </w:r>
+    </w:p>
+    <w:p>
+      <w:pPr>
+        <w:spacing w:after="80" w:before="80"/>
+      </w:pPr>
+      <w:r>
+        <w:rPr>
+          <w:rFonts w:ascii="Calibri" w:cs="Calibri" w:eastAsia="Calibri" w:hAnsi="Calibri"/>
+          <w:b w:val="false"/>
+          <w:bCs w:val="false"/>
+          <w:i w:val="false"/>
+          <w:iCs w:val="false"/>
+          <w:color w:val="1E293B"/>
+          <w:sz w:val="22"/>
+          <w:szCs w:val="22"/>
+        </w:rPr>
+        <w:t xml:space="preserve">3. Active Billing State: Shows line-by-line items scanned in real-time, photos, applied discounts, and total savings.</w:t>
+      </w:r>
+    </w:p>
+    <w:p>
+      <w:pPr>
+        <w:spacing w:after="80" w:before="80"/>
+      </w:pPr>
+      <w:r>
+        <w:rPr>
+          <w:rFonts w:ascii="Calibri" w:cs="Calibri" w:eastAsia="Calibri" w:hAnsi="Calibri"/>
+          <w:b w:val="false"/>
+          <w:bCs w:val="false"/>
+          <w:i w:val="false"/>
+          <w:iCs w:val="false"/>
+          <w:color w:val="1E293B"/>
+          <w:sz w:val="22"/>
+          <w:szCs w:val="22"/>
+        </w:rPr>
+        <w:t xml:space="preserve">4. Payment State: Displays a high-contrast, full-screen Dynamic UPI QR Code for instant customer scanning.</w:t>
+      </w:r>
+    </w:p>
+    <w:p>
+      <w:r>
+        <w:br w:type="page"/>
+      </w:r>
+    </w:p>
+    <w:p>
+      <w:pPr>
+        <w:pStyle w:val="Heading1"/>
+        <w:spacing w:after="150" w:before="400"/>
+        <w:rPr>
+          <w:rFonts w:ascii="Calibri" w:cs="Calibri" w:eastAsia="Calibri" w:hAnsi="Calibri"/>
+          <w:b/>
+          <w:bCs/>
+          <w:color w:val="005A9C"/>
+          <w:sz w:val="32"/>
+          <w:szCs w:val="32"/>
+        </w:rPr>
+      </w:pPr>
+      <w:r>
+        <w:t xml:space="preserve">Chapter 5: Staff Management &amp; Role-Based Access Control (RBAC)</w:t>
+      </w:r>
+    </w:p>
+    <w:p>
+      <w:pPr>
+        <w:spacing w:after="80" w:before="80"/>
+      </w:pPr>
+      <w:r>
+        <w:rPr>
+          <w:rFonts w:ascii="Calibri" w:cs="Calibri" w:eastAsia="Calibri" w:hAnsi="Calibri"/>
+          <w:b w:val="false"/>
+          <w:bCs w:val="false"/>
+          <w:i w:val="false"/>
+          <w:iCs w:val="false"/>
+          <w:color w:val="1E293B"/>
+          <w:sz w:val="22"/>
+          <w:szCs w:val="22"/>
+        </w:rPr>
+        <w:t xml:space="preserve">KwikStore Pro supports multi-user staff security so you can hire cashiers and billing operators without giving them access to confidential profit margins, financial reports, or store settings.</w:t>
+      </w:r>
+    </w:p>
+    <w:p>
+      <w:pPr>
+        <w:pStyle w:val="Heading2"/>
+        <w:spacing w:after="120" w:before="280"/>
+        <w:rPr>
+          <w:rFonts w:ascii="Calibri" w:cs="Calibri" w:eastAsia="Calibri" w:hAnsi="Calibri"/>
+          <w:b/>
+          <w:bCs/>
+          <w:color w:val="008080"/>
+          <w:sz w:val="26"/>
+          <w:szCs w:val="26"/>
+        </w:rPr>
+      </w:pPr>
+      <w:r>
+        <w:t xml:space="preserve">5.1 User Roles in KwikStore Pro</w:t>
       </w:r>
     </w:p>
     <w:tbl>
@@ -2943,7 +3616,7 @@
         </w:rPr>
       </w:pPr>
       <w:r>
-        <w:t xml:space="preserve">4.2 Adding a New Cashier</w:t>
+        <w:t xml:space="preserve">5.2 Adding a New Cashier</w:t>
       </w:r>
     </w:p>
     <w:p>
@@ -3037,7 +3710,7 @@
         </w:rPr>
       </w:pPr>
       <w:r>
-        <w:t xml:space="preserve">Chapter 5: Master Inventory &amp; Product Catalog Setup</w:t>
+        <w:t xml:space="preserve">Chapter 6: Master Inventory &amp; Product Catalog Setup</w:t>
       </w:r>
     </w:p>
     <w:p>
@@ -3072,7 +3745,7 @@
         </w:rPr>
       </w:pPr>
       <w:r>
-        <w:t xml:space="preserve">5.1 Adding a Single Product</w:t>
+        <w:t xml:space="preserve">6.1 Adding a Single Product</w:t>
       </w:r>
     </w:p>
     <w:p>
@@ -3219,7 +3892,7 @@
           <w:sz w:val="22"/>
           <w:szCs w:val="22"/>
         </w:rPr>
-        <w:t xml:space="preserve">Discounted tier rate for bulk buyers or contractors.</w:t>
+        <w:t xml:space="preserve">Discounted tier rates for bulk buyers, retailers, or dealers.</w:t>
       </w:r>
     </w:p>
     <w:p>
@@ -3261,7 +3934,7 @@
         </w:rPr>
       </w:pPr>
       <w:r>
-        <w:t xml:space="preserve">5.2 Industry-Specific Item Attributes</w:t>
+        <w:t xml:space="preserve">6.2 Industry-Specific Item Attributes</w:t>
       </w:r>
     </w:p>
     <w:p>
@@ -3327,16 +4000,16 @@
           <w:sz w:val="22"/>
           <w:szCs w:val="22"/>
         </w:rPr>
-        <w:t xml:space="preserve">• 🔩 For Hardware &amp; Building: </w:t>
-      </w:r>
-      <w:r>
-        <w:rPr>
-          <w:rFonts w:ascii="Calibri" w:cs="Calibri" w:eastAsia="Calibri" w:hAnsi="Calibri"/>
-          <w:color w:val="1E293B"/>
-          <w:sz w:val="22"/>
-          <w:szCs w:val="22"/>
-        </w:rPr>
-        <w:t xml:space="preserve">Select Dual Units (e.g. 1 Box = 50 Pieces or 1 Roll = 100 Meters).</w:t>
+        <w:t xml:space="preserve">• 🔩 For Hardware &amp; Wholesale: </w:t>
+      </w:r>
+      <w:r>
+        <w:rPr>
+          <w:rFonts w:ascii="Calibri" w:cs="Calibri" w:eastAsia="Calibri" w:hAnsi="Calibri"/>
+          <w:color w:val="1E293B"/>
+          <w:sz w:val="22"/>
+          <w:szCs w:val="22"/>
+        </w:rPr>
+        <w:t xml:space="preserve">Select Dual Units (e.g. 1 Box = 50 Pieces or 1 Bag = 50 Kgs).</w:t>
       </w:r>
     </w:p>
     <w:p>
@@ -3378,7 +4051,7 @@
         </w:rPr>
       </w:pPr>
       <w:r>
-        <w:t xml:space="preserve">5.3 Bulk Product Import via Excel / CSV</w:t>
+        <w:t xml:space="preserve">6.3 Bulk Product Import via Excel / CSV</w:t>
       </w:r>
     </w:p>
     <w:p>
@@ -3472,25 +4145,25 @@
         </w:rPr>
       </w:pPr>
       <w:r>
-        <w:t xml:space="preserve">Chapter 6: POS Fast Billing Counter (Day-to-Day Operations)</w:t>
-      </w:r>
-    </w:p>
-    <w:p>
-      <w:pPr>
-        <w:spacing w:after="80" w:before="80"/>
-      </w:pPr>
-      <w:r>
-        <w:rPr>
-          <w:rFonts w:ascii="Calibri" w:cs="Calibri" w:eastAsia="Calibri" w:hAnsi="Calibri"/>
-          <w:b w:val="false"/>
-          <w:bCs w:val="false"/>
-          <w:i w:val="false"/>
-          <w:iCs w:val="false"/>
-          <w:color w:val="1E293B"/>
-          <w:sz w:val="22"/>
-          <w:szCs w:val="22"/>
-        </w:rPr>
-        <w:t xml:space="preserve">The POS Billing counter is engineered for lightning-fast checkouts with keyboard-only shortcuts and barcode scanner support.</w:t>
+        <w:t xml:space="preserve">Chapter 7: POS Fast Billing Counter (Day-to-Day Operations)</w:t>
+      </w:r>
+    </w:p>
+    <w:p>
+      <w:pPr>
+        <w:spacing w:after="80" w:before="80"/>
+      </w:pPr>
+      <w:r>
+        <w:rPr>
+          <w:rFonts w:ascii="Calibri" w:cs="Calibri" w:eastAsia="Calibri" w:hAnsi="Calibri"/>
+          <w:b w:val="false"/>
+          <w:bCs w:val="false"/>
+          <w:i w:val="false"/>
+          <w:iCs w:val="false"/>
+          <w:color w:val="1E293B"/>
+          <w:sz w:val="22"/>
+          <w:szCs w:val="22"/>
+        </w:rPr>
+        <w:t xml:space="preserve">The POS Billing counter is engineered for lightning-fast checkouts with keyboard-only shortcuts, rate tier switching, and barcode scanner support.</w:t>
       </w:r>
     </w:p>
     <w:p>
@@ -3507,7 +4180,7 @@
         </w:rPr>
       </w:pPr>
       <w:r>
-        <w:t xml:space="preserve">6.1 Standard 3-Step Checkout Flow</w:t>
+        <w:t xml:space="preserve">7.1 Standard 3-Step Checkout Flow</w:t>
       </w:r>
     </w:p>
     <w:p>
@@ -3561,25 +4234,25 @@
           <w:sz w:val="22"/>
           <w:szCs w:val="22"/>
         </w:rPr>
-        <w:t xml:space="preserve">Step 2: Customer Selection (Optional)</w:t>
-      </w:r>
-    </w:p>
-    <w:p>
-      <w:pPr>
-        <w:spacing w:after="80" w:before="80"/>
-      </w:pPr>
-      <w:r>
-        <w:rPr>
-          <w:rFonts w:ascii="Calibri" w:cs="Calibri" w:eastAsia="Calibri" w:hAnsi="Calibri"/>
-          <w:b w:val="false"/>
-          <w:bCs w:val="false"/>
-          <w:i w:val="false"/>
-          <w:iCs w:val="false"/>
-          <w:color w:val="1E293B"/>
-          <w:sz w:val="22"/>
-          <w:szCs w:val="22"/>
-        </w:rPr>
-        <w:t xml:space="preserve">Type the customer's mobile number. If they are a returning customer, their name and Khata balance load automatically. For B2B tax invoices, enter their GSTIN to print a valid B2B Tax Invoice.</w:t>
+        <w:t xml:space="preserve">Step 2: Customer &amp; Rate Tier Selection (Optional)</w:t>
+      </w:r>
+    </w:p>
+    <w:p>
+      <w:pPr>
+        <w:spacing w:after="80" w:before="80"/>
+      </w:pPr>
+      <w:r>
+        <w:rPr>
+          <w:rFonts w:ascii="Calibri" w:cs="Calibri" w:eastAsia="Calibri" w:hAnsi="Calibri"/>
+          <w:b w:val="false"/>
+          <w:bCs w:val="false"/>
+          <w:i w:val="false"/>
+          <w:iCs w:val="false"/>
+          <w:color w:val="1E293B"/>
+          <w:sz w:val="22"/>
+          <w:szCs w:val="22"/>
+        </w:rPr>
+        <w:t xml:space="preserve">Type the customer's mobile number. If they are a Wholesale or Dealer customer, their rate tier automatically applies. For B2B tax invoices, enter their GSTIN to print a valid B2B Tax Invoice with E-Way Bill support.</w:t>
       </w:r>
     </w:p>
     <w:p>
@@ -3615,7 +4288,7 @@
           <w:sz w:val="22"/>
           <w:szCs w:val="22"/>
         </w:rPr>
-        <w:t xml:space="preserve">Press F10 or click "Settle &amp; Print". Choose payment method (Cash, UPI QR, Card, or Credit Khata) and the receipt prints instantly.</w:t>
+        <w:t xml:space="preserve">Press F10 or click "Settle &amp; Print". Choose payment method (Cash, UPI QR, Card, Split Payment, or Credit Khata) and the receipt prints instantly.</w:t>
       </w:r>
     </w:p>
     <w:p>
@@ -3632,7 +4305,7 @@
         </w:rPr>
       </w:pPr>
       <w:r>
-        <w:t xml:space="preserve">6.2 Essential Keyboard Shortcuts Cheat-Sheet</w:t>
+        <w:t xml:space="preserve">7.2 Essential Keyboard Shortcuts Cheat-Sheet</w:t>
       </w:r>
     </w:p>
     <w:tbl>
@@ -4504,7 +5177,7 @@
         </w:rPr>
       </w:pPr>
       <w:r>
-        <w:t xml:space="preserve">6.3 UPI Dynamic Payment QR Code</w:t>
+        <w:t xml:space="preserve">7.3 UPI Dynamic Payment QR Code</w:t>
       </w:r>
     </w:p>
     <w:p>
@@ -4544,7 +5217,7 @@
         </w:rPr>
       </w:pPr>
       <w:r>
-        <w:t xml:space="preserve">Chapter 7: Customer Khata &amp; Udhar (Credit) Management</w:t>
+        <w:t xml:space="preserve">Chapter 8: Customer Khata &amp; Udhar (Credit) Management</w:t>
       </w:r>
     </w:p>
     <w:p>
@@ -4579,7 +5252,7 @@
         </w:rPr>
       </w:pPr>
       <w:r>
-        <w:t xml:space="preserve">7.1 Selling on Credit (Full or Partial Udhar)</w:t>
+        <w:t xml:space="preserve">8.1 Selling on Credit (Full or Partial Udhar)</w:t>
       </w:r>
     </w:p>
     <w:p>
@@ -4650,7 +5323,7 @@
         </w:rPr>
       </w:pPr>
       <w:r>
-        <w:t xml:space="preserve">7.2 Receiving Khata Repayments</w:t>
+        <w:t xml:space="preserve">8.2 Receiving Khata Repayments</w:t>
       </w:r>
     </w:p>
     <w:p>
@@ -4722,7 +5395,7 @@
           <w:sz w:val="22"/>
           <w:szCs w:val="22"/>
         </w:rPr>
-        <w:t xml:space="preserve">4. The customer's ledger is instantly updated and a printable payment receipt is generated.</w:t>
+        <w:t xml:space="preserve">4. The customer's ledger is instantly updated and a printable payment statement is generated.</w:t>
       </w:r>
     </w:p>
     <w:p>
@@ -4744,7 +5417,7 @@
         </w:rPr>
       </w:pPr>
       <w:r>
-        <w:t xml:space="preserve">Chapter 8: Reports, Profit &amp; Loss &amp; GSTR-1 Tax Filing</w:t>
+        <w:t xml:space="preserve">Chapter 9: Reports, Profit &amp; Loss &amp; GSTR-1 Tax Filing</w:t>
       </w:r>
     </w:p>
     <w:p>
@@ -4779,7 +5452,7 @@
         </w:rPr>
       </w:pPr>
       <w:r>
-        <w:t xml:space="preserve">8.1 Reports Tabs Overview</w:t>
+        <w:t xml:space="preserve">9.1 Reports Tabs Overview</w:t>
       </w:r>
     </w:p>
     <w:p>
@@ -4804,7 +5477,7 @@
           <w:sz w:val="22"/>
           <w:szCs w:val="22"/>
         </w:rPr>
-        <w:t xml:space="preserve">View, filter, and inspect every invoice generated. Filter by Date, Cashier, Payment Mode, or Invoice Type. 1-click A4 invoice re-printing.</w:t>
+        <w:t xml:space="preserve">View, filter, and inspect every invoice generated. Filter by Date (Today, Weekly, Monthly, Custom Range), Cashier, Payment Mode, or Invoice Type. 1-click A4 invoice re-printing and PDF downloads.</w:t>
       </w:r>
     </w:p>
     <w:p>
@@ -4829,7 +5502,7 @@
           <w:sz w:val="22"/>
           <w:szCs w:val="22"/>
         </w:rPr>
-        <w:t xml:space="preserve">Live gross turnover, total Cost of Goods Sold (COGS), Net Gross Profit (₹), and Overall Profit Margin (%). Item-by-item profit breakdown showing your most profitable items.</w:t>
+        <w:t xml:space="preserve">Live gross turnover, total Cost of Goods Sold (COGS), Net Gross Profit (₹), and Overall Profit Margin (%). Item-by-item profit breakdown showing your highest margin items.</w:t>
       </w:r>
     </w:p>
     <w:p>
@@ -4871,7 +5544,7 @@
         </w:rPr>
       </w:pPr>
       <w:r>
-        <w:t xml:space="preserve">8.2 1-Click Excel / CSV Exports</w:t>
+        <w:t xml:space="preserve">9.2 1-Click Excel / CSV Exports</w:t>
       </w:r>
     </w:p>
     <w:p>
@@ -4983,7 +5656,7 @@
         </w:rPr>
       </w:pPr>
       <w:r>
-        <w:t xml:space="preserve">Chapter 9: Data Backup, Disaster Recovery &amp; PC Migration</w:t>
+        <w:t xml:space="preserve">Chapter 10: Data Backup, Disaster Recovery &amp; PC Migration</w:t>
       </w:r>
     </w:p>
     <w:p>
@@ -5000,7 +5673,7 @@
         </w:rPr>
       </w:pPr>
       <w:r>
-        <w:t xml:space="preserve">9.1 1-Click Database Backup</w:t>
+        <w:t xml:space="preserve">10.1 1-Click Database Backup</w:t>
       </w:r>
     </w:p>
     <w:p>
@@ -5089,7 +5762,7 @@
         </w:rPr>
       </w:pPr>
       <w:r>
-        <w:t xml:space="preserve">9.2 PC Crash Disaster Recovery &amp; Reinstallation</w:t>
+        <w:t xml:space="preserve">10.2 PC Crash Disaster Recovery &amp; Reinstallation</w:t>
       </w:r>
     </w:p>
     <w:p>
@@ -5125,7 +5798,7 @@
           <w:sz w:val="22"/>
           <w:szCs w:val="22"/>
         </w:rPr>
-        <w:t xml:space="preserve">1. Install KwikStore Pro fresh on the new PC from your setup file (KwikStore Pro Setup 1.0.0.exe).</w:t>
+        <w:t xml:space="preserve">1. Install KwikStore Pro fresh on the new PC from your setup file (KwikStore Pro Setup 1.1.0.exe).</w:t>
       </w:r>
     </w:p>
     <w:p>
@@ -5198,6 +5871,28 @@
           <w:szCs w:val="22"/>
         </w:rPr>
         <w:t xml:space="preserve">5. All your historical bills, stock balances, khata ledgers, and accounts are instantly restored!</w:t>
+      </w:r>
+    </w:p>
+    <w:p>
+      <w:r>
+        <w:br w:type="page"/>
+      </w:r>
+    </w:p>
+    <w:p>
+      <w:pPr>
+        <w:pStyle w:val="Heading1"/>
+        <w:spacing w:after="150" w:before="400"/>
+        <w:rPr>
+          <w:rFonts w:ascii="Calibri" w:cs="Calibri" w:eastAsia="Calibri" w:hAnsi="Calibri"/>
+          <w:b/>
+          <w:bCs/>
+          <w:color w:val="005A9C"/>
+          <w:sz w:val="32"/>
+          <w:szCs w:val="32"/>
+        </w:rPr>
+      </w:pPr>
+      <w:r>
+        <w:t xml:space="preserve">Chapter 11: Developer Maintenance, FAQs &amp; Troubleshooting</w:t>
       </w:r>
     </w:p>
     <w:p>
@@ -5214,101 +5909,79 @@
         </w:rPr>
       </w:pPr>
       <w:r>
-        <w:t xml:space="preserve">9.3 Multi-Counter LAN Billing (Multi-PC Setup)</w:t>
-      </w:r>
-    </w:p>
-    <w:p>
-      <w:pPr>
-        <w:spacing w:after="80" w:before="80"/>
-      </w:pPr>
-      <w:r>
-        <w:rPr>
-          <w:rFonts w:ascii="Calibri" w:cs="Calibri" w:eastAsia="Calibri" w:hAnsi="Calibri"/>
-          <w:b w:val="false"/>
-          <w:bCs w:val="false"/>
-          <w:i w:val="false"/>
-          <w:iCs w:val="false"/>
-          <w:color w:val="1E293B"/>
-          <w:sz w:val="22"/>
-          <w:szCs w:val="22"/>
-        </w:rPr>
-        <w:t xml:space="preserve">If you have multiple billing counters (e.g. Counter 1, Counter 2, Admin Office):</w:t>
-      </w:r>
-    </w:p>
-    <w:p>
-      <w:pPr>
-        <w:spacing w:after="80" w:before="80"/>
-      </w:pPr>
-      <w:r>
-        <w:rPr>
-          <w:rFonts w:ascii="Calibri" w:cs="Calibri" w:eastAsia="Calibri" w:hAnsi="Calibri"/>
-          <w:b w:val="false"/>
-          <w:bCs w:val="false"/>
-          <w:i w:val="false"/>
-          <w:iCs w:val="false"/>
-          <w:color w:val="1E293B"/>
-          <w:sz w:val="22"/>
-          <w:szCs w:val="22"/>
-        </w:rPr>
-        <w:t xml:space="preserve">1. Counter 1 (Main Server PC): Runs KwikStore Pro and acts as the master database host on your local Wi-Fi / LAN network.</w:t>
-      </w:r>
-    </w:p>
-    <w:p>
-      <w:pPr>
-        <w:spacing w:after="80" w:before="80"/>
-      </w:pPr>
-      <w:r>
-        <w:rPr>
-          <w:rFonts w:ascii="Calibri" w:cs="Calibri" w:eastAsia="Calibri" w:hAnsi="Calibri"/>
-          <w:b w:val="false"/>
-          <w:bCs w:val="false"/>
-          <w:i w:val="false"/>
-          <w:iCs w:val="false"/>
-          <w:color w:val="1E293B"/>
-          <w:sz w:val="22"/>
-          <w:szCs w:val="22"/>
-        </w:rPr>
-        <w:t xml:space="preserve">2. Counter 2 &amp; 3 (Satellite Terminals): Open their web browser or KwikStore client and connect to Counter 1's IP address (e.g. http://192.168.1.10:4848).</w:t>
-      </w:r>
-    </w:p>
-    <w:p>
-      <w:pPr>
-        <w:spacing w:after="80" w:before="80"/>
-      </w:pPr>
-      <w:r>
-        <w:rPr>
-          <w:rFonts w:ascii="Calibri" w:cs="Calibri" w:eastAsia="Calibri" w:hAnsi="Calibri"/>
-          <w:b w:val="false"/>
-          <w:bCs w:val="false"/>
-          <w:i w:val="false"/>
-          <w:iCs w:val="false"/>
-          <w:color w:val="1E293B"/>
-          <w:sz w:val="22"/>
-          <w:szCs w:val="22"/>
-        </w:rPr>
-        <w:t xml:space="preserve">3. All counters share real-time synchronized stock, price updates, and customer khata seamlessly!</w:t>
-      </w:r>
-    </w:p>
-    <w:p>
-      <w:r>
-        <w:br w:type="page"/>
-      </w:r>
-    </w:p>
-    <w:p>
-      <w:pPr>
-        <w:pStyle w:val="Heading1"/>
-        <w:spacing w:after="150" w:before="400"/>
-        <w:rPr>
-          <w:rFonts w:ascii="Calibri" w:cs="Calibri" w:eastAsia="Calibri" w:hAnsi="Calibri"/>
-          <w:b/>
-          <w:bCs/>
-          <w:color w:val="005A9C"/>
-          <w:sz w:val="32"/>
-          <w:szCs w:val="32"/>
-        </w:rPr>
-      </w:pPr>
-      <w:r>
-        <w:t xml:space="preserve">Chapter 10: Developer Maintenance, FAQs &amp; Troubleshooting</w:t>
+        <w:t xml:space="preserve">11.1 License Renewal &amp; In-App Management</w:t>
+      </w:r>
+    </w:p>
+    <w:p>
+      <w:pPr>
+        <w:spacing w:after="80" w:before="80"/>
+      </w:pPr>
+      <w:r>
+        <w:rPr>
+          <w:rFonts w:ascii="Calibri" w:cs="Calibri" w:eastAsia="Calibri" w:hAnsi="Calibri"/>
+          <w:b w:val="false"/>
+          <w:bCs w:val="false"/>
+          <w:i w:val="false"/>
+          <w:iCs w:val="false"/>
+          <w:color w:val="1E293B"/>
+          <w:sz w:val="22"/>
+          <w:szCs w:val="22"/>
+        </w:rPr>
+        <w:t xml:space="preserve">To check your remaining subscription days or renew your key:</w:t>
+      </w:r>
+    </w:p>
+    <w:p>
+      <w:pPr>
+        <w:spacing w:after="80" w:before="80"/>
+      </w:pPr>
+      <w:r>
+        <w:rPr>
+          <w:rFonts w:ascii="Calibri" w:cs="Calibri" w:eastAsia="Calibri" w:hAnsi="Calibri"/>
+          <w:b w:val="false"/>
+          <w:bCs w:val="false"/>
+          <w:i w:val="false"/>
+          <w:iCs w:val="false"/>
+          <w:color w:val="1E293B"/>
+          <w:sz w:val="22"/>
+          <w:szCs w:val="22"/>
+        </w:rPr>
+        <w:t xml:space="preserve">1. Click "License &amp; Security" in the sidebar.</w:t>
+      </w:r>
+    </w:p>
+    <w:p>
+      <w:pPr>
+        <w:spacing w:after="80" w:before="80"/>
+      </w:pPr>
+      <w:r>
+        <w:rPr>
+          <w:rFonts w:ascii="Calibri" w:cs="Calibri" w:eastAsia="Calibri" w:hAnsi="Calibri"/>
+          <w:b w:val="false"/>
+          <w:bCs w:val="false"/>
+          <w:i w:val="false"/>
+          <w:iCs w:val="false"/>
+          <w:color w:val="1E293B"/>
+          <w:sz w:val="22"/>
+          <w:szCs w:val="22"/>
+        </w:rPr>
+        <w:t xml:space="preserve">2. View your active Plan Tier, Expiry Date, and remaining days.</w:t>
+      </w:r>
+    </w:p>
+    <w:p>
+      <w:pPr>
+        <w:spacing w:after="80" w:before="80"/>
+      </w:pPr>
+      <w:r>
+        <w:rPr>
+          <w:rFonts w:ascii="Calibri" w:cs="Calibri" w:eastAsia="Calibri" w:hAnsi="Calibri"/>
+          <w:b w:val="false"/>
+          <w:bCs w:val="false"/>
+          <w:i w:val="false"/>
+          <w:iCs w:val="false"/>
+          <w:color w:val="1E293B"/>
+          <w:sz w:val="22"/>
+          <w:szCs w:val="22"/>
+        </w:rPr>
+        <w:t xml:space="preserve">3. Click "Renew License" to enter a new activation key upon subscription renewal.</w:t>
       </w:r>
     </w:p>
     <w:p>
@@ -5325,79 +5998,43 @@
         </w:rPr>
       </w:pPr>
       <w:r>
-        <w:t xml:space="preserve">10.1 License Renewal &amp; In-App Management</w:t>
-      </w:r>
-    </w:p>
-    <w:p>
-      <w:pPr>
-        <w:spacing w:after="80" w:before="80"/>
-      </w:pPr>
-      <w:r>
-        <w:rPr>
-          <w:rFonts w:ascii="Calibri" w:cs="Calibri" w:eastAsia="Calibri" w:hAnsi="Calibri"/>
-          <w:b w:val="false"/>
-          <w:bCs w:val="false"/>
-          <w:i w:val="false"/>
-          <w:iCs w:val="false"/>
-          <w:color w:val="1E293B"/>
-          <w:sz w:val="22"/>
-          <w:szCs w:val="22"/>
-        </w:rPr>
-        <w:t xml:space="preserve">To check your remaining subscription days or renew your key:</w:t>
-      </w:r>
-    </w:p>
-    <w:p>
-      <w:pPr>
-        <w:spacing w:after="80" w:before="80"/>
-      </w:pPr>
-      <w:r>
-        <w:rPr>
-          <w:rFonts w:ascii="Calibri" w:cs="Calibri" w:eastAsia="Calibri" w:hAnsi="Calibri"/>
-          <w:b w:val="false"/>
-          <w:bCs w:val="false"/>
-          <w:i w:val="false"/>
-          <w:iCs w:val="false"/>
-          <w:color w:val="1E293B"/>
-          <w:sz w:val="22"/>
-          <w:szCs w:val="22"/>
-        </w:rPr>
-        <w:t xml:space="preserve">1. Click "License &amp; Security" in the sidebar.</w:t>
-      </w:r>
-    </w:p>
-    <w:p>
-      <w:pPr>
-        <w:spacing w:after="80" w:before="80"/>
-      </w:pPr>
-      <w:r>
-        <w:rPr>
-          <w:rFonts w:ascii="Calibri" w:cs="Calibri" w:eastAsia="Calibri" w:hAnsi="Calibri"/>
-          <w:b w:val="false"/>
-          <w:bCs w:val="false"/>
-          <w:i w:val="false"/>
-          <w:iCs w:val="false"/>
-          <w:color w:val="1E293B"/>
-          <w:sz w:val="22"/>
-          <w:szCs w:val="22"/>
-        </w:rPr>
-        <w:t xml:space="preserve">2. View your active Plan Tier, Expiry Date, and remaining days.</w:t>
-      </w:r>
-    </w:p>
-    <w:p>
-      <w:pPr>
-        <w:spacing w:after="80" w:before="80"/>
-      </w:pPr>
-      <w:r>
-        <w:rPr>
-          <w:rFonts w:ascii="Calibri" w:cs="Calibri" w:eastAsia="Calibri" w:hAnsi="Calibri"/>
-          <w:b w:val="false"/>
-          <w:bCs w:val="false"/>
-          <w:i w:val="false"/>
-          <w:iCs w:val="false"/>
-          <w:color w:val="1E293B"/>
-          <w:sz w:val="22"/>
-          <w:szCs w:val="22"/>
-        </w:rPr>
-        <w:t xml:space="preserve">3. Click "Renew License" to enter a new activation key upon subscription renewal.</w:t>
+        <w:t xml:space="preserve">11.2 Developer Master Maintenance Mode (For Sellers)</w:t>
+      </w:r>
+    </w:p>
+    <w:p>
+      <w:pPr>
+        <w:spacing w:after="80" w:before="80"/>
+      </w:pPr>
+      <w:r>
+        <w:rPr>
+          <w:rFonts w:ascii="Calibri" w:cs="Calibri" w:eastAsia="Calibri" w:hAnsi="Calibri"/>
+          <w:b w:val="false"/>
+          <w:bCs w:val="false"/>
+          <w:i w:val="false"/>
+          <w:iCs w:val="false"/>
+          <w:color w:val="1E293B"/>
+          <w:sz w:val="22"/>
+          <w:szCs w:val="22"/>
+        </w:rPr>
+        <w:t xml:space="preserve">If a customer ever locks themselves out or requires emergency database service:</w:t>
+      </w:r>
+    </w:p>
+    <w:p>
+      <w:pPr>
+        <w:spacing w:after="80" w:before="80"/>
+      </w:pPr>
+      <w:r>
+        <w:rPr>
+          <w:rFonts w:ascii="Calibri" w:cs="Calibri" w:eastAsia="Calibri" w:hAnsi="Calibri"/>
+          <w:b w:val="false"/>
+          <w:bCs w:val="false"/>
+          <w:i w:val="false"/>
+          <w:iCs w:val="false"/>
+          <w:color w:val="1E293B"/>
+          <w:sz w:val="22"/>
+          <w:szCs w:val="22"/>
+        </w:rPr>
+        <w:t xml:space="preserve">• The authorized developer/seller can enter the Developer Master PIN (990011) to bypass lockouts and service the customer database without data loss.</w:t>
       </w:r>
     </w:p>
     <w:p>
@@ -5414,43 +6051,151 @@
         </w:rPr>
       </w:pPr>
       <w:r>
-        <w:t xml:space="preserve">10.2 Developer Master Maintenance Mode (For Sellers)</w:t>
-      </w:r>
-    </w:p>
-    <w:p>
-      <w:pPr>
-        <w:spacing w:after="80" w:before="80"/>
-      </w:pPr>
-      <w:r>
-        <w:rPr>
-          <w:rFonts w:ascii="Calibri" w:cs="Calibri" w:eastAsia="Calibri" w:hAnsi="Calibri"/>
-          <w:b w:val="false"/>
-          <w:bCs w:val="false"/>
-          <w:i w:val="false"/>
-          <w:iCs w:val="false"/>
-          <w:color w:val="1E293B"/>
-          <w:sz w:val="22"/>
-          <w:szCs w:val="22"/>
-        </w:rPr>
-        <w:t xml:space="preserve">If a customer ever locks themselves out or requires emergency database service:</w:t>
-      </w:r>
-    </w:p>
-    <w:p>
-      <w:pPr>
-        <w:spacing w:after="80" w:before="80"/>
-      </w:pPr>
-      <w:r>
-        <w:rPr>
-          <w:rFonts w:ascii="Calibri" w:cs="Calibri" w:eastAsia="Calibri" w:hAnsi="Calibri"/>
-          <w:b w:val="false"/>
-          <w:bCs w:val="false"/>
-          <w:i w:val="false"/>
-          <w:iCs w:val="false"/>
-          <w:color w:val="1E293B"/>
-          <w:sz w:val="22"/>
-          <w:szCs w:val="22"/>
-        </w:rPr>
-        <w:t xml:space="preserve">• The authorized developer/seller can enter the Developer Master PIN (990011) to bypass lockouts and service the customer database without data loss.</w:t>
+        <w:t xml:space="preserve">11.3 Frequently Asked Questions (FAQs)</w:t>
+      </w:r>
+    </w:p>
+    <w:p>
+      <w:pPr>
+        <w:spacing w:after="80" w:before="80"/>
+      </w:pPr>
+      <w:r>
+        <w:rPr>
+          <w:rFonts w:ascii="Calibri" w:cs="Calibri" w:eastAsia="Calibri" w:hAnsi="Calibri"/>
+          <w:b w:val="false"/>
+          <w:bCs w:val="false"/>
+          <w:i w:val="false"/>
+          <w:iCs w:val="false"/>
+          <w:color w:val="1E293B"/>
+          <w:sz w:val="22"/>
+          <w:szCs w:val="22"/>
+        </w:rPr>
+        <w:t xml:space="preserve">Q1: How do I change the store name or phone number on bills?</w:t>
+      </w:r>
+    </w:p>
+    <w:p>
+      <w:pPr>
+        <w:spacing w:after="80" w:before="80"/>
+      </w:pPr>
+      <w:r>
+        <w:rPr>
+          <w:rFonts w:ascii="Calibri" w:cs="Calibri" w:eastAsia="Calibri" w:hAnsi="Calibri"/>
+          <w:b w:val="false"/>
+          <w:bCs w:val="false"/>
+          <w:i w:val="false"/>
+          <w:iCs w:val="false"/>
+          <w:color w:val="1E293B"/>
+          <w:sz w:val="22"/>
+          <w:szCs w:val="22"/>
+        </w:rPr>
+        <w:t xml:space="preserve">A: Go to Settings ➔ Shop &amp; Invoice Settings. Edit your store name, address, or phone and click Save Changes.</w:t>
+      </w:r>
+    </w:p>
+    <w:p>
+      <w:pPr>
+        <w:spacing w:after="80" w:before="80"/>
+      </w:pPr>
+      <w:r>
+        <w:rPr>
+          <w:rFonts w:ascii="Calibri" w:cs="Calibri" w:eastAsia="Calibri" w:hAnsi="Calibri"/>
+          <w:b w:val="false"/>
+          <w:bCs w:val="false"/>
+          <w:i w:val="false"/>
+          <w:iCs w:val="false"/>
+          <w:color w:val="1E293B"/>
+          <w:sz w:val="22"/>
+          <w:szCs w:val="22"/>
+        </w:rPr>
+        <w:t xml:space="preserve">Q2: My barcode scanner is not submitting items automatically.</w:t>
+      </w:r>
+    </w:p>
+    <w:p>
+      <w:pPr>
+        <w:spacing w:after="80" w:before="80"/>
+      </w:pPr>
+      <w:r>
+        <w:rPr>
+          <w:rFonts w:ascii="Calibri" w:cs="Calibri" w:eastAsia="Calibri" w:hAnsi="Calibri"/>
+          <w:b w:val="false"/>
+          <w:bCs w:val="false"/>
+          <w:i w:val="false"/>
+          <w:iCs w:val="false"/>
+          <w:color w:val="1E293B"/>
+          <w:sz w:val="22"/>
+          <w:szCs w:val="22"/>
+        </w:rPr>
+        <w:t xml:space="preserve">A: Ensure your barcode scanner is configured to send an "Enter / CR (Carriage Return)" suffix after each scan. This is a standard setting in your scanner's user manual barcode sheet.</w:t>
+      </w:r>
+    </w:p>
+    <w:p>
+      <w:pPr>
+        <w:spacing w:after="80" w:before="80"/>
+      </w:pPr>
+      <w:r>
+        <w:rPr>
+          <w:rFonts w:ascii="Calibri" w:cs="Calibri" w:eastAsia="Calibri" w:hAnsi="Calibri"/>
+          <w:b w:val="false"/>
+          <w:bCs w:val="false"/>
+          <w:i w:val="false"/>
+          <w:iCs w:val="false"/>
+          <w:color w:val="1E293B"/>
+          <w:sz w:val="22"/>
+          <w:szCs w:val="22"/>
+        </w:rPr>
+        <w:t xml:space="preserve">Q3: Can I run multiple billing counters on different PCs?</w:t>
+      </w:r>
+    </w:p>
+    <w:p>
+      <w:pPr>
+        <w:spacing w:after="80" w:before="80"/>
+      </w:pPr>
+      <w:r>
+        <w:rPr>
+          <w:rFonts w:ascii="Calibri" w:cs="Calibri" w:eastAsia="Calibri" w:hAnsi="Calibri"/>
+          <w:b w:val="false"/>
+          <w:bCs w:val="false"/>
+          <w:i w:val="false"/>
+          <w:iCs w:val="false"/>
+          <w:color w:val="1E293B"/>
+          <w:sz w:val="22"/>
+          <w:szCs w:val="22"/>
+        </w:rPr>
+        <w:t xml:space="preserve">A: Yes! Keep your main PC in "Master Host" mode, and point all secondary counter PCs or laptops to the master's LAN IP (e.g. http://192.168.1.50:4848).</w:t>
+      </w:r>
+    </w:p>
+    <w:p>
+      <w:pPr>
+        <w:spacing w:after="80" w:before="80"/>
+      </w:pPr>
+      <w:r>
+        <w:rPr>
+          <w:rFonts w:ascii="Calibri" w:cs="Calibri" w:eastAsia="Calibri" w:hAnsi="Calibri"/>
+          <w:b w:val="false"/>
+          <w:bCs w:val="false"/>
+          <w:i w:val="false"/>
+          <w:iCs w:val="false"/>
+          <w:color w:val="1E293B"/>
+          <w:sz w:val="22"/>
+          <w:szCs w:val="22"/>
+        </w:rPr>
+        <w:t xml:space="preserve">Q4: Can I run this software when the internet is down?</w:t>
+      </w:r>
+    </w:p>
+    <w:p>
+      <w:pPr>
+        <w:spacing w:after="80" w:before="80"/>
+      </w:pPr>
+      <w:r>
+        <w:rPr>
+          <w:rFonts w:ascii="Calibri" w:cs="Calibri" w:eastAsia="Calibri" w:hAnsi="Calibri"/>
+          <w:b w:val="false"/>
+          <w:bCs w:val="false"/>
+          <w:i w:val="false"/>
+          <w:iCs w:val="false"/>
+          <w:color w:val="1E293B"/>
+          <w:sz w:val="22"/>
+          <w:szCs w:val="22"/>
+        </w:rPr>
+        <w:t xml:space="preserve">A: Yes! KwikStore Pro is 100% offline-first. Internet is only required if you wish to check for software updates online.</w:t>
       </w:r>
     </w:p>
     <w:p>
@@ -5467,132 +6212,7 @@
         </w:rPr>
       </w:pPr>
       <w:r>
-        <w:t xml:space="preserve">10.3 Frequently Asked Questions (FAQs)</w:t>
-      </w:r>
-    </w:p>
-    <w:p>
-      <w:pPr>
-        <w:spacing w:after="80" w:before="80"/>
-      </w:pPr>
-      <w:r>
-        <w:rPr>
-          <w:rFonts w:ascii="Calibri" w:cs="Calibri" w:eastAsia="Calibri" w:hAnsi="Calibri"/>
-          <w:b w:val="false"/>
-          <w:bCs w:val="false"/>
-          <w:i w:val="false"/>
-          <w:iCs w:val="false"/>
-          <w:color w:val="1E293B"/>
-          <w:sz w:val="22"/>
-          <w:szCs w:val="22"/>
-        </w:rPr>
-        <w:t xml:space="preserve">Q1: How do I change the store name or phone number on bills?</w:t>
-      </w:r>
-    </w:p>
-    <w:p>
-      <w:pPr>
-        <w:spacing w:after="80" w:before="80"/>
-      </w:pPr>
-      <w:r>
-        <w:rPr>
-          <w:rFonts w:ascii="Calibri" w:cs="Calibri" w:eastAsia="Calibri" w:hAnsi="Calibri"/>
-          <w:b w:val="false"/>
-          <w:bCs w:val="false"/>
-          <w:i w:val="false"/>
-          <w:iCs w:val="false"/>
-          <w:color w:val="1E293B"/>
-          <w:sz w:val="22"/>
-          <w:szCs w:val="22"/>
-        </w:rPr>
-        <w:t xml:space="preserve">A: Go to Settings ➔ Shop &amp; Invoice Settings. Edit your store name, address, or phone and click Save Changes.</w:t>
-      </w:r>
-    </w:p>
-    <w:p>
-      <w:pPr>
-        <w:spacing w:after="80" w:before="80"/>
-      </w:pPr>
-      <w:r>
-        <w:rPr>
-          <w:rFonts w:ascii="Calibri" w:cs="Calibri" w:eastAsia="Calibri" w:hAnsi="Calibri"/>
-          <w:b w:val="false"/>
-          <w:bCs w:val="false"/>
-          <w:i w:val="false"/>
-          <w:iCs w:val="false"/>
-          <w:color w:val="1E293B"/>
-          <w:sz w:val="22"/>
-          <w:szCs w:val="22"/>
-        </w:rPr>
-        <w:t xml:space="preserve">Q2: My barcode scanner is not submitting items automatically.</w:t>
-      </w:r>
-    </w:p>
-    <w:p>
-      <w:pPr>
-        <w:spacing w:after="80" w:before="80"/>
-      </w:pPr>
-      <w:r>
-        <w:rPr>
-          <w:rFonts w:ascii="Calibri" w:cs="Calibri" w:eastAsia="Calibri" w:hAnsi="Calibri"/>
-          <w:b w:val="false"/>
-          <w:bCs w:val="false"/>
-          <w:i w:val="false"/>
-          <w:iCs w:val="false"/>
-          <w:color w:val="1E293B"/>
-          <w:sz w:val="22"/>
-          <w:szCs w:val="22"/>
-        </w:rPr>
-        <w:t xml:space="preserve">A: Ensure your barcode scanner is configured to send an "Enter / CR (Carriage Return)" suffix after each scan. This is a standard setting in your scanner's user manual barcode sheet.</w:t>
-      </w:r>
-    </w:p>
-    <w:p>
-      <w:pPr>
-        <w:spacing w:after="80" w:before="80"/>
-      </w:pPr>
-      <w:r>
-        <w:rPr>
-          <w:rFonts w:ascii="Calibri" w:cs="Calibri" w:eastAsia="Calibri" w:hAnsi="Calibri"/>
-          <w:b w:val="false"/>
-          <w:bCs w:val="false"/>
-          <w:i w:val="false"/>
-          <w:iCs w:val="false"/>
-          <w:color w:val="1E293B"/>
-          <w:sz w:val="22"/>
-          <w:szCs w:val="22"/>
-        </w:rPr>
-        <w:t xml:space="preserve">Q3: Can I run this software when the internet is down?</w:t>
-      </w:r>
-    </w:p>
-    <w:p>
-      <w:pPr>
-        <w:spacing w:after="80" w:before="80"/>
-      </w:pPr>
-      <w:r>
-        <w:rPr>
-          <w:rFonts w:ascii="Calibri" w:cs="Calibri" w:eastAsia="Calibri" w:hAnsi="Calibri"/>
-          <w:b w:val="false"/>
-          <w:bCs w:val="false"/>
-          <w:i w:val="false"/>
-          <w:iCs w:val="false"/>
-          <w:color w:val="1E293B"/>
-          <w:sz w:val="22"/>
-          <w:szCs w:val="22"/>
-        </w:rPr>
-        <w:t xml:space="preserve">A: Yes! KwikStore Pro is 100% offline-first. Internet is only required if you wish to check for software updates online.</w:t>
-      </w:r>
-    </w:p>
-    <w:p>
-      <w:pPr>
-        <w:pStyle w:val="Heading2"/>
-        <w:spacing w:after="120" w:before="280"/>
-        <w:rPr>
-          <w:rFonts w:ascii="Calibri" w:cs="Calibri" w:eastAsia="Calibri" w:hAnsi="Calibri"/>
-          <w:b/>
-          <w:bCs/>
-          <w:color w:val="008080"/>
-          <w:sz w:val="26"/>
-          <w:szCs w:val="26"/>
-        </w:rPr>
-      </w:pPr>
-      <w:r>
-        <w:t xml:space="preserve">10.4 Customer Support &amp; Assistance</w:t>
+        <w:t xml:space="preserve">11.4 Customer Support &amp; Assistance</w:t>
       </w:r>
     </w:p>
     <w:p>
@@ -5660,7 +6280,7 @@
           <w:sz w:val="22"/>
           <w:szCs w:val="22"/>
         </w:rPr>
-        <w:t xml:space="preserve">https://fleetbillpro.com</w:t>
+        <w:t xml:space="preserve">https://fleetbillpro.in</w:t>
       </w:r>
     </w:p>
     <w:p>
@@ -5676,16 +6296,16 @@
           <w:sz w:val="22"/>
           <w:szCs w:val="22"/>
         </w:rPr>
-        <w:t xml:space="preserve">• Software Repository: </w:t>
-      </w:r>
-      <w:r>
-        <w:rPr>
-          <w:rFonts w:ascii="Calibri" w:cs="Calibri" w:eastAsia="Calibri" w:hAnsi="Calibri"/>
-          <w:color w:val="1E293B"/>
-          <w:sz w:val="22"/>
-          <w:szCs w:val="22"/>
-        </w:rPr>
-        <w:t xml:space="preserve">https://github.com/RJRAJESH14/KwikStore</w:t>
+        <w:t xml:space="preserve">• Cloud Update Channel: </w:t>
+      </w:r>
+      <w:r>
+        <w:rPr>
+          <w:rFonts w:ascii="Calibri" w:cs="Calibri" w:eastAsia="Calibri" w:hAnsi="Calibri"/>
+          <w:color w:val="1E293B"/>
+          <w:sz w:val="22"/>
+          <w:szCs w:val="22"/>
+        </w:rPr>
+        <w:t xml:space="preserve">https://fleetbillpro.in/updates</w:t>
       </w:r>
     </w:p>
     <w:sectPr>
@@ -5751,7 +6371,7 @@
         <w:sz w:val="16"/>
         <w:szCs w:val="16"/>
       </w:rPr>
-      <w:t xml:space="preserve">Helpline: +91 8338833377 | https://fleetbillpro.com</w:t>
+      <w:t xml:space="preserve">Helpline: +91 8338833377 | https://fleetbillpro.in</w:t>
     </w:r>
     <w:r>
       <w:rPr>

</xml_diff>